<commit_message>
fix: gültige DOCX-Vorlage (w:tr vs. w:trPr), Favicon von berent.ai
- Template-Build: Zeilenstart nur bei echtem <w:tr>, nicht bei <w:trPr>
- invoice-template.docx neu erzeugt, damit document.xml wohlgeformt ist
- Favicon: logo-kompakt-farbe.webp aus berent.ai, metadata.icons in layout

Made-with: Cursor
</commit_message>
<xml_diff>
--- a/assets/templates/invoice-template.docx
+++ b/assets/templates/invoice-template.docx
@@ -1,6 +1,1754 @@
 
-<file path=word/document.xml><?xml version="1.0" encoding="UTF-8" standalone="yes"?>
-<w:document xmlns:o="urn:schemas-microsoft-com:office:office" xmlns:r="http://schemas.openxmlformats.org/officeDocument/2006/relationships" xmlns:v="urn:schemas-microsoft-com:vml" xmlns:w="http://schemas.openxmlformats.org/wordprocessingml/2006/main" xmlns:w10="urn:schemas-microsoft-com:office:word" xmlns:wp="http://schemas.openxmlformats.org/drawingml/2006/wordprocessingDrawing" xmlns:pic="http://schemas.openxmlformats.org/drawingml/2006/picture" xmlns:wps="http://schemas.microsoft.com/office/word/2010/wordprocessingShape" xmlns:wpg="http://schemas.microsoft.com/office/word/2010/wordprocessingGroup" xmlns:mc="http://schemas.openxmlformats.org/markup-compatibility/2006" xmlns:wp14="http://schemas.microsoft.com/office/word/2010/wordprocessingDrawing" xmlns:w14="http://schemas.microsoft.com/office/word/2010/wordml" xmlns:w15="http://schemas.microsoft.com/office/word/2012/wordml" mc:Ignorable="w14 wp14 w15"><w:body><w:p><w:pPr><w:pStyle w:val="Normal"/><w:tabs><w:tab w:val="clear" w:pos="708"/><w:tab w:val="left" w:pos="924" w:leader="none"/></w:tabs><w:rPr><w:rFonts w:ascii="Arial" w:hAnsi="Arial" w:cs="Arial"/></w:rPr></w:pPr><w:r><w:rPr><w:rFonts w:cs="Arial" w:ascii="Arial" w:hAnsi="Arial"/></w:rPr><w:softHyphen/><w:softHyphen/></w:r></w:p><w:p><w:pPr><w:pStyle w:val="Normal"/><w:tabs><w:tab w:val="clear" w:pos="708"/><w:tab w:val="left" w:pos="924" w:leader="none"/></w:tabs><w:rPr><w:b/><w:color w:val="FF0000"/></w:rPr></w:pPr><w:r><w:rPr><w:b/><w:color w:val="FF0000"/></w:rPr></w:r></w:p><w:p><w:pPr><w:pStyle w:val="Normal"/><w:spacing w:lineRule="auto" w:line="240" w:before="0" w:after="0"/><w:rPr></w:rPr></w:pPr><w:r><w:rPr></w:rPr></w:r></w:p><w:p><w:pPr><w:pStyle w:val="Normal"/><w:spacing w:lineRule="auto" w:line="240" w:before="0" w:after="0"/><w:rPr><w:rFonts w:ascii="Century Gothic" w:hAnsi="Century Gothic" w:eastAsia="Times New Roman" w:cs="Arial"/><w:sz w:val="16"/><w:szCs w:val="16"/></w:rPr></w:pPr><w:r><w:rPr><w:rFonts w:eastAsia="Times New Roman" w:cs="Arial" w:ascii="Century Gothic" w:hAnsi="Century Gothic"/><w:sz w:val="16"/><w:szCs w:val="16"/></w:rPr></w:r></w:p><w:p><w:pPr><w:pStyle w:val="Normal"/><w:spacing w:lineRule="auto" w:line="240" w:before="0" w:after="0"/><w:rPr><w:rFonts w:ascii="Century Gothic" w:hAnsi="Century Gothic" w:eastAsia="Times New Roman" w:cs="Arial"/><w:sz w:val="18"/><w:szCs w:val="18"/></w:rPr></w:pPr><w:r><w:rPr><w:rFonts w:eastAsia="Times New Roman" w:cs="Arial"/><w:sz w:val="12"/><w:szCs w:val="12"/></w:rPr><w:t>Heinrich Professional Consultant Network GmbH • Egeriaplatz 3 • 72074 Tübingen</w:t></w:r><w:r><w:rPr><w:rFonts w:eastAsia="Times New Roman" w:cs="Arial" w:ascii="Century Gothic" w:hAnsi="Century Gothic"/><w:sz w:val="18"/><w:szCs w:val="18"/></w:rPr><w:tab/><w:tab/><w:tab/><w:tab/></w:r></w:p><w:p><w:pPr><w:pStyle w:val="Normal"/><w:spacing w:lineRule="auto" w:line="240" w:before="0" w:after="0"/><w:rPr><w:rFonts w:ascii="Century Gothic" w:hAnsi="Century Gothic" w:eastAsia="Times New Roman" w:cs="Arial"/><w:sz w:val="16"/><w:szCs w:val="16"/></w:rPr></w:pPr><w:r><w:rPr><w:rFonts w:eastAsia="Times New Roman" w:cs="Arial" w:ascii="Century Gothic" w:hAnsi="Century Gothic"/><w:sz w:val="16"/><w:szCs w:val="16"/></w:rPr></w:r></w:p><w:p><w:pPr><w:pStyle w:val="Normal"/><w:numPr><w:ilvl w:val="0"/><w:numId w:val="0"/></w:numPr><w:spacing w:lineRule="auto" w:line="240" w:before="0" w:after="0"/><w:outlineLvl w:val="0"/><w:rPr><w:rFonts w:ascii="Century Gothic" w:hAnsi="Century Gothic" w:eastAsia="Times New Roman" w:cs="Arial"/><w:sz w:val="18"/><w:szCs w:val="18"/></w:rPr></w:pPr><w:r><w:rPr><w:rFonts w:eastAsia="Times New Roman" w:cs="Arial" w:ascii="Century Gothic" w:hAnsi="Century Gothic"/><w:sz w:val="18"/><w:szCs w:val="18"/></w:rPr><w:t>Göhrum Fahrzeugteile GmbH</w:t></w:r></w:p><w:p><w:pPr><w:pStyle w:val="Normal"/><w:numPr><w:ilvl w:val="0"/><w:numId w:val="0"/></w:numPr><w:spacing w:lineRule="auto" w:line="240" w:before="0" w:after="0"/><w:outlineLvl w:val="0"/><w:rPr><w:rFonts w:ascii="Century Gothic" w:hAnsi="Century Gothic" w:eastAsia="Times New Roman" w:cs="Arial"/><w:sz w:val="18"/><w:szCs w:val="18"/></w:rPr></w:pPr><w:r><w:rPr><w:rFonts w:eastAsia="Times New Roman" w:cs="Arial" w:ascii="Century Gothic" w:hAnsi="Century Gothic"/><w:sz w:val="18"/><w:szCs w:val="18"/></w:rPr><w:t>Ulmenstraße 19</w:t></w:r></w:p><w:p><w:pPr><w:pStyle w:val="Normal"/><w:spacing w:lineRule="auto" w:line="240" w:before="0" w:after="0"/><w:rPr><w:rFonts w:ascii="Century Gothic" w:hAnsi="Century Gothic" w:eastAsia="Times New Roman" w:cs="Arial"/><w:b/><w:sz w:val="20"/><w:szCs w:val="20"/></w:rPr></w:pPr><w:r><w:rPr><w:rFonts w:eastAsia="Times New Roman" w:cs="Arial" w:ascii="Century Gothic" w:hAnsi="Century Gothic"/><w:sz w:val="18"/><w:szCs w:val="18"/></w:rPr><w:t>71069 Sindelfingen</w:t><w:tab/><w:tab/><w:tab/><w:tab/><w:tab/><w:tab/><w:tab/><w:tab/></w:r><w:r><w:rPr><w:rFonts w:eastAsia="Times New Roman" w:cs="Arial" w:ascii="Century Gothic" w:hAnsi="Century Gothic"/><w:b/><w:sz w:val="20"/><w:szCs w:val="20"/></w:rPr><w:t xml:space="preserve">Datum: </w:t></w:r><w:r><w:rPr><w:rFonts w:eastAsia="Times New Roman" w:cs="Arial" w:ascii="Century Gothic" w:hAnsi="Century Gothic"/><w:b/><w:sz w:val="20"/><w:szCs w:val="20"/></w:rPr><w:t>{invoiceDate}</w:t></w:r><w:r><w:rPr><w:rFonts w:eastAsia="Times New Roman" w:cs="Arial" w:ascii="Century Gothic" w:hAnsi="Century Gothic"/><w:b/><w:sz w:val="20"/><w:szCs w:val="20"/></w:rPr><w:tab/></w:r></w:p><w:p><w:pPr><w:pStyle w:val="Normal"/><w:spacing w:lineRule="auto" w:line="240" w:before="0" w:after="0"/><w:rPr><w:rFonts w:ascii="Century Gothic" w:hAnsi="Century Gothic" w:eastAsia="Times New Roman" w:cs="Arial"/><w:sz w:val="18"/><w:szCs w:val="18"/></w:rPr></w:pPr><w:r><w:rPr><w:rFonts w:eastAsia="Times New Roman" w:cs="Arial" w:ascii="Century Gothic" w:hAnsi="Century Gothic"/><w:sz w:val="18"/><w:szCs w:val="18"/></w:rPr><w:tab/><w:tab/><w:tab/><w:tab/><w:tab/><w:tab/><w:tab/><w:tab/><w:tab/><w:tab/></w:r></w:p><w:p><w:pPr><w:pStyle w:val="Normal"/><w:spacing w:lineRule="auto" w:line="240" w:before="0" w:after="0"/><w:rPr><w:rFonts w:ascii="Century Gothic" w:hAnsi="Century Gothic" w:eastAsia="Times New Roman" w:cs="Arial"/><w:sz w:val="16"/><w:szCs w:val="16"/></w:rPr></w:pPr><w:r><w:rPr><w:rFonts w:eastAsia="Times New Roman" w:cs="Arial" w:ascii="Century Gothic" w:hAnsi="Century Gothic"/><w:sz w:val="16"/><w:szCs w:val="16"/></w:rPr></w:r></w:p><w:p><w:pPr><w:pStyle w:val="Normal"/><w:numPr><w:ilvl w:val="0"/><w:numId w:val="0"/></w:numPr><w:spacing w:lineRule="auto" w:line="240" w:before="0" w:after="0"/><w:ind w:firstLine="708" w:start="6372"/><w:outlineLvl w:val="0"/><w:rPr><w:rFonts w:ascii="Century Gothic" w:hAnsi="Century Gothic" w:eastAsia="Times New Roman" w:cs="Arial"/><w:b/><w:color w:val="4D4D4D"/><w:sz w:val="16"/><w:szCs w:val="16"/><w:u w:val="single"/></w:rPr></w:pPr><w:r><w:rPr><w:rFonts w:eastAsia="Times New Roman" w:cs="Arial" w:ascii="Century Gothic" w:hAnsi="Century Gothic"/><w:b/><w:color w:val="4D4D4D"/><w:sz w:val="16"/><w:szCs w:val="16"/><w:u w:val="single"/></w:rPr><w:t>Bestell-/Auftragsdaten:</w:t></w:r></w:p><w:p><w:pPr><w:pStyle w:val="Normal"/><w:numPr><w:ilvl w:val="0"/><w:numId w:val="0"/></w:numPr><w:spacing w:lineRule="auto" w:line="240" w:before="0" w:after="0"/><w:outlineLvl w:val="0"/><w:rPr><w:rFonts w:ascii="Century Gothic" w:hAnsi="Century Gothic" w:eastAsia="Times New Roman" w:cs="Arial"/><w:color w:val="4D4D4D"/><w:sz w:val="16"/><w:szCs w:val="16"/></w:rPr></w:pPr><w:r><w:rPr><w:rFonts w:eastAsia="Times New Roman" w:cs="Arial" w:ascii="Century Gothic" w:hAnsi="Century Gothic"/><w:color w:val="4D4D4D"/><w:sz w:val="16"/><w:szCs w:val="16"/></w:rPr><w:tab/><w:tab/><w:tab/><w:tab/><w:tab/><w:tab/><w:tab/><w:tab/><w:tab/><w:tab/><w:t xml:space="preserve">Besteller: </w:t></w:r></w:p><w:p><w:pPr><w:pStyle w:val="Normal"/><w:numPr><w:ilvl w:val="0"/><w:numId w:val="0"/></w:numPr><w:spacing w:lineRule="auto" w:line="240" w:before="0" w:after="0"/><w:outlineLvl w:val="0"/><w:rPr><w:rFonts w:ascii="Century Gothic" w:hAnsi="Century Gothic" w:eastAsia="Times New Roman" w:cs="Arial"/><w:color w:val="4D4D4D"/><w:sz w:val="16"/><w:szCs w:val="16"/></w:rPr></w:pPr><w:r><w:rPr><w:rFonts w:eastAsia="Times New Roman" w:cs="Arial" w:ascii="Century Gothic" w:hAnsi="Century Gothic"/><w:color w:val="4D4D4D"/><w:sz w:val="16"/><w:szCs w:val="16"/></w:rPr><w:tab/><w:tab/><w:tab/><w:tab/><w:tab/><w:tab/><w:tab/><w:tab/><w:tab/><w:tab/><w:t>Ihre Ust-ID: DE145144224</w:t></w:r></w:p><w:p><w:pPr><w:pStyle w:val="Normal"/><w:numPr><w:ilvl w:val="0"/><w:numId w:val="0"/></w:numPr><w:spacing w:lineRule="auto" w:line="240" w:before="0" w:after="0"/><w:outlineLvl w:val="0"/><w:rPr><w:rFonts w:ascii="Century Gothic" w:hAnsi="Century Gothic" w:eastAsia="Times New Roman" w:cs="Arial"/><w:b/><w:bCs/><w:color w:val="4D4D4D"/><w:sz w:val="16"/><w:szCs w:val="16"/></w:rPr></w:pPr><w:r><w:rPr><w:rFonts w:eastAsia="Times New Roman" w:cs="Arial" w:ascii="Century Gothic" w:hAnsi="Century Gothic"/><w:color w:val="4D4D4D"/><w:sz w:val="16"/><w:szCs w:val="16"/></w:rPr><w:tab/><w:tab/><w:tab/><w:tab/><w:tab/><w:tab/><w:tab/><w:tab/><w:tab/><w:tab/></w:r><w:r><w:rPr><w:rFonts w:eastAsia="Times New Roman" w:cs="Arial" w:ascii="Century Gothic" w:hAnsi="Century Gothic"/><w:b/><w:bCs/><w:color w:val="4D4D4D"/><w:sz w:val="16"/><w:szCs w:val="16"/></w:rPr><w:t>Kd.-Nr.: 10602</w:t></w:r></w:p><w:p><w:pPr><w:pStyle w:val="Normal"/><w:spacing w:lineRule="auto" w:line="240" w:before="0" w:after="0"/><w:rPr><w:rFonts w:ascii="Century Gothic" w:hAnsi="Century Gothic" w:eastAsia="Times New Roman" w:cs="Arial"/><w:sz w:val="18"/><w:szCs w:val="18"/></w:rPr></w:pPr><w:r><w:rPr><w:rFonts w:eastAsia="Times New Roman" w:cs="Arial" w:ascii="Century Gothic" w:hAnsi="Century Gothic"/><w:sz w:val="18"/><w:szCs w:val="18"/></w:rPr></w:r></w:p><w:p><w:pPr><w:pStyle w:val="Normal"/><w:numPr><w:ilvl w:val="0"/><w:numId w:val="0"/></w:numPr><w:spacing w:lineRule="auto" w:line="240" w:before="0" w:after="0"/><w:outlineLvl w:val="0"/><w:rPr><w:rFonts w:ascii="Century Gothic" w:hAnsi="Century Gothic" w:eastAsia="Times New Roman" w:cs="Arial"/><w:b/><w:color w:val="4D4D4D"/><w:sz w:val="16"/><w:szCs w:val="16"/><w:u w:val="single"/></w:rPr></w:pPr><w:r><w:rPr><w:rFonts w:eastAsia="Times New Roman" w:cs="Arial" w:ascii="Century Gothic" w:hAnsi="Century Gothic"/><w:color w:val="4D4D4D"/><w:sz w:val="16"/><w:szCs w:val="16"/></w:rPr><w:tab/><w:tab/><w:tab/><w:tab/><w:tab/><w:tab/><w:tab/><w:tab/><w:tab/><w:tab/></w:r><w:r><w:rPr><w:rFonts w:eastAsia="Times New Roman" w:cs="Arial" w:ascii="Century Gothic" w:hAnsi="Century Gothic"/><w:b/><w:color w:val="4D4D4D"/><w:sz w:val="16"/><w:szCs w:val="16"/><w:u w:val="single"/></w:rPr><w:t>Bei Rückfragen:</w:t></w:r></w:p><w:p><w:pPr><w:pStyle w:val="Normal"/><w:numPr><w:ilvl w:val="0"/><w:numId w:val="0"/></w:numPr><w:spacing w:lineRule="auto" w:line="240" w:before="0" w:after="0"/><w:outlineLvl w:val="0"/><w:rPr><w:rFonts w:ascii="Century Gothic" w:hAnsi="Century Gothic" w:eastAsia="Times New Roman" w:cs="Arial"/><w:color w:val="4D4D4D"/><w:sz w:val="16"/><w:szCs w:val="16"/></w:rPr></w:pPr><w:r><w:rPr><w:rFonts w:eastAsia="Times New Roman" w:cs="Arial" w:ascii="Century Gothic" w:hAnsi="Century Gothic"/><w:color w:val="4D4D4D"/><w:sz w:val="16"/><w:szCs w:val="16"/></w:rPr><w:tab/><w:tab/><w:tab/><w:tab/><w:tab/><w:tab/><w:tab/><w:tab/><w:tab/><w:tab/><w:t>Herr Wolfgang Heinrich</w:t></w:r></w:p><w:p><w:pPr><w:pStyle w:val="Normal"/><w:numPr><w:ilvl w:val="0"/><w:numId w:val="0"/></w:numPr><w:spacing w:lineRule="auto" w:line="240" w:before="0" w:after="0"/><w:outlineLvl w:val="0"/><w:rPr><w:rFonts w:ascii="Century Gothic" w:hAnsi="Century Gothic" w:eastAsia="Times New Roman" w:cs="Arial"/><w:color w:val="4D4D4D"/><w:sz w:val="16"/><w:szCs w:val="16"/><w:lang w:val="en-US"/></w:rPr></w:pPr><w:r><w:rPr><w:rFonts w:eastAsia="Times New Roman" w:cs="Arial" w:ascii="Century Gothic" w:hAnsi="Century Gothic"/><w:color w:val="4D4D4D"/><w:sz w:val="16"/><w:szCs w:val="16"/></w:rPr><w:tab/><w:tab/><w:tab/><w:tab/><w:tab/><w:tab/><w:tab/><w:tab/><w:tab/><w:tab/></w:r><w:r><w:rPr><w:rFonts w:eastAsia="Times New Roman" w:cs="Arial" w:ascii="Century Gothic" w:hAnsi="Century Gothic"/><w:color w:val="4D4D4D"/><w:sz w:val="16"/><w:szCs w:val="16"/><w:lang w:val="en-US"/></w:rPr><w:t>Tel.: 0049 7071 13 5 66-24</w:t></w:r></w:p><w:p><w:pPr><w:pStyle w:val="Normal"/><w:numPr><w:ilvl w:val="0"/><w:numId w:val="0"/></w:numPr><w:spacing w:lineRule="auto" w:line="240" w:before="0" w:after="0"/><w:outlineLvl w:val="0"/><w:rPr><w:rFonts w:ascii="Century Gothic" w:hAnsi="Century Gothic" w:eastAsia="Times New Roman" w:cs="Arial"/><w:color w:val="4D4D4D"/><w:sz w:val="16"/><w:szCs w:val="16"/><w:lang w:val="en-US"/></w:rPr></w:pPr><w:r><w:rPr><w:rFonts w:eastAsia="Times New Roman" w:cs="Arial" w:ascii="Century Gothic" w:hAnsi="Century Gothic"/><w:color w:val="4D4D4D"/><w:sz w:val="16"/><w:szCs w:val="16"/><w:lang w:val="en-US"/></w:rPr><w:tab/><w:tab/><w:tab/><w:tab/><w:tab/><w:tab/><w:tab/><w:tab/><w:tab/><w:tab/><w:t>Mail: heinrich@h-pcn.de</w:t></w:r></w:p><w:p><w:pPr><w:pStyle w:val="Normal"/><w:spacing w:lineRule="auto" w:line="240" w:before="0" w:after="0"/><w:rPr><w:rFonts w:ascii="Century Gothic" w:hAnsi="Century Gothic" w:eastAsia="Times New Roman" w:cs="Arial"/><w:b/><w:sz w:val="24"/><w:szCs w:val="24"/><w:lang w:val="en-US"/></w:rPr></w:pPr><w:r><w:rPr><w:rFonts w:eastAsia="Times New Roman" w:cs="Arial" w:ascii="Century Gothic" w:hAnsi="Century Gothic"/><w:b/><w:sz w:val="24"/><w:szCs w:val="24"/><w:lang w:val="en-US"/></w:rPr></w:r></w:p><w:p><w:pPr><w:pStyle w:val="Normal"/><w:spacing w:lineRule="auto" w:line="240" w:before="0" w:after="0"/><w:rPr><w:rFonts w:ascii="Century Gothic" w:hAnsi="Century Gothic" w:eastAsia="Times New Roman" w:cs="Arial"/><w:b/><w:sz w:val="18"/><w:szCs w:val="18"/></w:rPr></w:pPr><w:r><w:rPr><w:rFonts w:eastAsia="Times New Roman" w:cs="Arial" w:ascii="Century Gothic" w:hAnsi="Century Gothic"/><w:b/><w:sz w:val="24"/><w:szCs w:val="24"/></w:rPr><w:t>Rechnungs-Nr.: {invoiceNumber}</w:t><w:tab/><w:tab/><w:tab/><w:tab/><w:tab/><w:tab/><w:tab/></w:r><w:r><w:rPr><w:rFonts w:eastAsia="Times New Roman" w:cs="Arial" w:ascii="Century Gothic" w:hAnsi="Century Gothic"/><w:b/><w:sz w:val="18"/><w:szCs w:val="18"/></w:rPr><w:t>Projekt: {projectTitle}</w:t></w:r></w:p><w:p><w:pPr><w:pStyle w:val="Normal"/><w:spacing w:lineRule="auto" w:line="240" w:before="0" w:after="0"/><w:rPr><w:rFonts w:ascii="Century Gothic" w:hAnsi="Century Gothic" w:eastAsia="Times New Roman" w:cs="Arial"/><w:b/><w:sz w:val="18"/><w:szCs w:val="18"/></w:rPr></w:pPr><w:r><w:rPr><w:rFonts w:eastAsia="Times New Roman" w:cs="Arial" w:ascii="Century Gothic" w:hAnsi="Century Gothic"/><w:b/><w:sz w:val="18"/><w:szCs w:val="18"/></w:rPr></w:r></w:p><w:p><w:pPr><w:pStyle w:val="Normal"/><w:tabs><w:tab w:val="left" w:pos="708" w:leader="none"/><w:tab w:val="left" w:pos="1416" w:leader="none"/><w:tab w:val="left" w:pos="2124" w:leader="none"/><w:tab w:val="left" w:pos="2832" w:leader="none"/><w:tab w:val="left" w:pos="3540" w:leader="none"/><w:tab w:val="left" w:pos="4248" w:leader="none"/><w:tab w:val="left" w:pos="5080" w:leader="none"/></w:tabs><w:spacing w:lineRule="auto" w:line="240" w:before="0" w:after="0"/><w:rPr><w:rFonts w:ascii="Century Gothic" w:hAnsi="Century Gothic" w:eastAsia="Times New Roman" w:cs="Arial"/><w:b/><w:sz w:val="16"/><w:szCs w:val="16"/></w:rPr></w:pPr><w:r><w:rPr><w:rFonts w:eastAsia="Times New Roman" w:cs="Arial" w:ascii="Century Gothic" w:hAnsi="Century Gothic"/><w:b/><w:sz w:val="16"/><w:szCs w:val="16"/></w:rPr><w:t xml:space="preserve">Rechnung per E-Mail an: </w:t></w:r><w:hyperlink r:id="rId2"><w:r><w:rPr><w:rStyle w:val="Hyperlink"/><w:rFonts w:eastAsia="Times New Roman" w:cs="Arial" w:ascii="Century Gothic" w:hAnsi="Century Gothic"/><w:b/><w:sz w:val="16"/><w:szCs w:val="16"/></w:rPr><w:t>matthias.meltsch@goehrum-teile.com</w:t></w:r></w:hyperlink></w:p><w:p><w:pPr><w:pStyle w:val="Normal"/><w:spacing w:lineRule="auto" w:line="240" w:before="0" w:after="0"/><w:rPr><w:rFonts w:ascii="Century Gothic" w:hAnsi="Century Gothic" w:eastAsia="Times New Roman" w:cs="Arial"/><w:b/></w:rPr></w:pPr><w:r><w:rPr><w:rFonts w:eastAsia="Times New Roman" w:cs="Arial" w:ascii="Century Gothic" w:hAnsi="Century Gothic"/><w:b/></w:rPr></w:r></w:p><w:p><w:pPr><w:pStyle w:val="Normal"/><w:spacing w:lineRule="auto" w:line="240" w:before="0" w:after="0"/><w:rPr><w:rFonts w:ascii="Century Gothic" w:hAnsi="Century Gothic" w:eastAsia="Times New Roman" w:cs="Arial"/><w:sz w:val="18"/><w:szCs w:val="18"/></w:rPr></w:pPr><w:r><w:rPr><w:rFonts w:eastAsia="Times New Roman" w:cs="Arial" w:ascii="Century Gothic" w:hAnsi="Century Gothic"/><w:sz w:val="18"/><w:szCs w:val="18"/></w:rPr><w:t xml:space="preserve">Für die unten aufgeführten und in Auftrag gegebenen Lieferungen und Leistungen erlauben wir uns, </w:t></w:r></w:p><w:p><w:pPr><w:pStyle w:val="Normal"/><w:spacing w:lineRule="auto" w:line="240" w:before="0" w:after="0"/><w:rPr><w:rFonts w:ascii="Century Gothic" w:hAnsi="Century Gothic" w:eastAsia="Times New Roman" w:cs="Arial"/><w:bCs/><w:sz w:val="18"/><w:szCs w:val="18"/><w:lang w:val="de-CH" w:eastAsia="en-US"/></w:rPr></w:pPr><w:r><w:rPr><w:rFonts w:eastAsia="Times New Roman" w:cs="Arial" w:ascii="Century Gothic" w:hAnsi="Century Gothic"/><w:sz w:val="18"/><w:szCs w:val="18"/></w:rPr><w:t>Ihnen folgendes zu berechnen:</w:t></w:r><w:r><w:rPr><w:rFonts w:eastAsia="Times New Roman" w:cs="Arial" w:ascii="Century Gothic" w:hAnsi="Century Gothic"/><w:sz w:val="16"/><w:szCs w:val="16"/></w:rPr><w:t xml:space="preserve"> </w:t></w:r><w:r><w:rPr><w:rFonts w:eastAsia="Times New Roman" w:cs="Arial" w:ascii="Century Gothic" w:hAnsi="Century Gothic"/><w:bCs/><w:sz w:val="18"/><w:szCs w:val="18"/><w:lang w:val="de-CH" w:eastAsia="en-US"/></w:rPr><w:t>Dienstleistungen von Herrn Kunkel gemäß vorliegenden Dienstleistungsnachweisen</w:t></w:r></w:p><w:p><w:pPr><w:pStyle w:val="Normal"/><w:spacing w:lineRule="auto" w:line="240" w:before="0" w:after="0"/><w:rPr><w:rFonts w:ascii="Century Gothic" w:hAnsi="Century Gothic" w:eastAsia="Times New Roman" w:cs="Arial"/><w:sz w:val="16"/><w:szCs w:val="16"/></w:rPr></w:pPr><w:r><w:rPr><w:rFonts w:eastAsia="Times New Roman" w:cs="Arial" w:ascii="Century Gothic" w:hAnsi="Century Gothic"/><w:sz w:val="16"/><w:szCs w:val="16"/></w:rPr></w:r></w:p><w:p><w:pPr><w:pStyle w:val="Normal"/><w:spacing w:lineRule="auto" w:line="240" w:before="0" w:after="0"/><w:rPr><w:rFonts w:ascii="Century Gothic" w:hAnsi="Century Gothic" w:eastAsia="Times New Roman" w:cs="Arial"/><w:sz w:val="18"/><w:szCs w:val="18"/></w:rPr></w:pPr><w:r><w:rPr><w:rFonts w:eastAsia="Times New Roman" w:cs="Arial" w:ascii="Century Gothic" w:hAnsi="Century Gothic"/><w:sz w:val="18"/><w:szCs w:val="18"/></w:rPr></w:r></w:p><w:tbl><w:tblPr><w:tblW w:w="9465" w:type="dxa"/><w:jc w:val="start"/><w:tblInd w:w="0" w:type="dxa"/><w:tblLayout w:type="fixed"/><w:tblCellMar><w:top w:w="0" w:type="dxa"/><w:start w:w="108" w:type="dxa"/><w:bottom w:w="0" w:type="dxa"/><w:end w:w="108" w:type="dxa"/></w:tblCellMar><w:tblLook w:val="01e0" w:noVBand="0" w:noHBand="0" w:lastColumn="1" w:firstColumn="1" w:lastRow="1" w:firstRow="1"/></w:tblPr><w:tblGrid><w:gridCol w:w="562"/><w:gridCol w:w="709"/><w:gridCol w:w="709"/><w:gridCol w:w="5386"/><w:gridCol w:w="994"/><w:gridCol w:w="1105"/></w:tblGrid><w:tr><w:trPr></w:trPr><w:tc><w:tcPr><w:tcW w:w="562" w:type="dxa"/><w:tcBorders><w:top w:val="single" w:sz="4" w:space="0" w:color="000000"/><w:start w:val="single" w:sz="4" w:space="0" w:color="000000"/><w:bottom w:val="single" w:sz="4" w:space="0" w:color="000000"/><w:end w:val="single" w:sz="4" w:space="0" w:color="000000"/></w:tcBorders></w:tcPr><w:p><w:pPr><w:pStyle w:val="Normal"/><w:spacing w:lineRule="auto" w:line="240" w:before="0" w:after="0"/><w:rPr><w:rFonts w:ascii="Century Gothic" w:hAnsi="Century Gothic" w:eastAsia="Times New Roman" w:cs="Arial"/><w:b/><w:sz w:val="18"/><w:szCs w:val="18"/><w:lang w:val="de-CH" w:eastAsia="en-US"/></w:rPr></w:pPr><w:r><w:rPr><w:rFonts w:eastAsia="Times New Roman" w:cs="Arial" w:ascii="Century Gothic" w:hAnsi="Century Gothic"/><w:b/><w:sz w:val="18"/><w:szCs w:val="18"/><w:lang w:val="de-CH" w:eastAsia="en-US"/></w:rPr><w:t>Pos</w:t></w:r></w:p></w:tc><w:tc><w:tcPr><w:tcW w:w="709" w:type="dxa"/><w:tcBorders><w:top w:val="single" w:sz="4" w:space="0" w:color="000000"/><w:start w:val="single" w:sz="4" w:space="0" w:color="000000"/><w:bottom w:val="single" w:sz="4" w:space="0" w:color="000000"/><w:end w:val="single" w:sz="4" w:space="0" w:color="000000"/></w:tcBorders></w:tcPr><w:p><w:pPr><w:pStyle w:val="Normal"/><w:spacing w:lineRule="auto" w:line="240" w:before="0" w:after="0"/><w:rPr><w:rFonts w:ascii="Century Gothic" w:hAnsi="Century Gothic" w:eastAsia="Times New Roman" w:cs="Arial"/><w:b/><w:sz w:val="18"/><w:szCs w:val="18"/><w:lang w:val="de-CH" w:eastAsia="en-US"/></w:rPr></w:pPr><w:r><w:rPr><w:rFonts w:eastAsia="Times New Roman" w:cs="Arial" w:ascii="Century Gothic" w:hAnsi="Century Gothic"/><w:b/><w:sz w:val="18"/><w:szCs w:val="18"/><w:lang w:val="de-CH" w:eastAsia="en-US"/></w:rPr><w:t>Anz.</w:t></w:r></w:p></w:tc><w:tc><w:tcPr><w:tcW w:w="709" w:type="dxa"/><w:tcBorders><w:top w:val="single" w:sz="4" w:space="0" w:color="000000"/><w:start w:val="single" w:sz="4" w:space="0" w:color="000000"/><w:bottom w:val="single" w:sz="4" w:space="0" w:color="000000"/><w:end w:val="single" w:sz="4" w:space="0" w:color="000000"/></w:tcBorders></w:tcPr><w:p><w:pPr><w:pStyle w:val="Normal"/><w:spacing w:lineRule="auto" w:line="240" w:before="0" w:after="0"/><w:rPr><w:rFonts w:ascii="Century Gothic" w:hAnsi="Century Gothic" w:eastAsia="Times New Roman" w:cs="Arial"/><w:b/><w:sz w:val="18"/><w:szCs w:val="18"/><w:lang w:val="de-CH" w:eastAsia="en-US"/></w:rPr></w:pPr><w:r><w:rPr><w:rFonts w:eastAsia="Times New Roman" w:cs="Arial" w:ascii="Century Gothic" w:hAnsi="Century Gothic"/><w:b/><w:sz w:val="18"/><w:szCs w:val="18"/><w:lang w:val="de-CH" w:eastAsia="en-US"/></w:rPr><w:t>LE</w:t></w:r></w:p><w:p><w:pPr><w:pStyle w:val="Normal"/><w:spacing w:lineRule="auto" w:line="240" w:before="0" w:after="0"/><w:rPr><w:rFonts w:ascii="Century Gothic" w:hAnsi="Century Gothic" w:eastAsia="Times New Roman" w:cs="Arial"/><w:b/><w:sz w:val="18"/><w:szCs w:val="18"/><w:lang w:val="de-CH" w:eastAsia="en-US"/></w:rPr></w:pPr><w:r><w:rPr><w:rFonts w:eastAsia="Times New Roman" w:cs="Arial" w:ascii="Century Gothic" w:hAnsi="Century Gothic"/><w:b/><w:sz w:val="18"/><w:szCs w:val="18"/><w:lang w:val="de-CH" w:eastAsia="en-US"/></w:rPr><w:t>Std.</w:t></w:r></w:p></w:tc><w:tc><w:tcPr><w:tcW w:w="5386" w:type="dxa"/><w:tcBorders><w:top w:val="single" w:sz="4" w:space="0" w:color="000000"/><w:start w:val="single" w:sz="4" w:space="0" w:color="000000"/><w:bottom w:val="single" w:sz="4" w:space="0" w:color="000000"/><w:end w:val="single" w:sz="4" w:space="0" w:color="000000"/></w:tcBorders></w:tcPr><w:p><w:pPr><w:pStyle w:val="Normal"/><w:tabs><w:tab w:val="clear" w:pos="708"/><w:tab w:val="left" w:pos="1428" w:leader="none"/><w:tab w:val="left" w:pos="1572" w:leader="none"/><w:tab w:val="left" w:pos="1691" w:leader="none"/></w:tabs><w:spacing w:lineRule="auto" w:line="240" w:before="0" w:after="0"/><w:rPr><w:rFonts w:ascii="Century Gothic" w:hAnsi="Century Gothic" w:eastAsia="Times New Roman" w:cs="Arial"/><w:b/><w:sz w:val="18"/><w:szCs w:val="18"/><w:lang w:val="de-CH" w:eastAsia="en-US"/></w:rPr></w:pPr><w:r><w:rPr><w:rFonts w:eastAsia="Times New Roman" w:cs="Arial" w:ascii="Century Gothic" w:hAnsi="Century Gothic"/><w:b/><w:sz w:val="18"/><w:szCs w:val="18"/><w:lang w:val="de-CH" w:eastAsia="en-US"/></w:rPr><w:t>Spezifikation</w:t><w:tab/><w:tab/><w:tab/></w:r></w:p></w:tc><w:tc><w:tcPr><w:tcW w:w="994" w:type="dxa"/><w:tcBorders><w:top w:val="single" w:sz="4" w:space="0" w:color="000000"/><w:start w:val="single" w:sz="4" w:space="0" w:color="000000"/><w:bottom w:val="single" w:sz="4" w:space="0" w:color="000000"/><w:end w:val="single" w:sz="4" w:space="0" w:color="000000"/></w:tcBorders></w:tcPr><w:p><w:pPr><w:pStyle w:val="Normal"/><w:spacing w:lineRule="auto" w:line="240" w:before="0" w:after="0"/><w:rPr><w:rFonts w:ascii="Century Gothic" w:hAnsi="Century Gothic" w:eastAsia="Times New Roman" w:cs="Arial"/><w:b/><w:sz w:val="18"/><w:szCs w:val="18"/><w:lang w:val="de-CH" w:eastAsia="en-US"/></w:rPr></w:pPr><w:r><w:rPr><w:rFonts w:eastAsia="Times New Roman" w:cs="Arial" w:ascii="Century Gothic" w:hAnsi="Century Gothic"/><w:b/><w:sz w:val="18"/><w:szCs w:val="18"/><w:lang w:val="de-CH" w:eastAsia="en-US"/></w:rPr><w:t>EP €</w:t></w:r></w:p></w:tc><w:tc><w:tcPr><w:tcW w:w="1105" w:type="dxa"/><w:tcBorders><w:top w:val="single" w:sz="4" w:space="0" w:color="000000"/><w:start w:val="single" w:sz="4" w:space="0" w:color="000000"/><w:bottom w:val="single" w:sz="4" w:space="0" w:color="000000"/><w:end w:val="single" w:sz="4" w:space="0" w:color="000000"/></w:tcBorders></w:tcPr><w:p><w:pPr><w:pStyle w:val="Normal"/><w:spacing w:lineRule="auto" w:line="240" w:before="0" w:after="0"/><w:rPr><w:rFonts w:ascii="Century Gothic" w:hAnsi="Century Gothic" w:eastAsia="Times New Roman" w:cs="Arial"/><w:b/><w:sz w:val="18"/><w:szCs w:val="18"/><w:lang w:val="de-CH" w:eastAsia="en-US"/></w:rPr></w:pPr><w:r><w:rPr><w:rFonts w:eastAsia="Times New Roman" w:cs="Arial" w:ascii="Century Gothic" w:hAnsi="Century Gothic"/><w:b/><w:sz w:val="18"/><w:szCs w:val="18"/><w:lang w:val="de-CH" w:eastAsia="en-US"/></w:rPr><w:t>GP € nt.</w:t></w:r></w:p></w:tc></w:tr><w:tr><w:trPr></w:trPr><w:tc><w:tcPr><w:tcW w:w="562" w:type="dxa"/><w:tcBorders><w:top w:val="single" w:sz="4" w:space="0" w:color="000000"/><w:start w:val="single" w:sz="4" w:space="0" w:color="000000"/><w:bottom w:val="single" w:sz="4" w:space="0" w:color="000000"/><w:end w:val="single" w:sz="4" w:space="0" w:color="000000"/></w:tcBorders></w:tcPr><w:p><w:pPr><w:pStyle w:val="Normal"/><w:spacing w:lineRule="auto" w:line="240" w:before="0" w:after="0"/><w:rPr><w:rFonts w:ascii="Century Gothic" w:hAnsi="Century Gothic" w:eastAsia="Times New Roman" w:cs="Arial"/><w:sz w:val="18"/><w:szCs w:val="18"/><w:lang w:val="de-CH" w:eastAsia="en-US"/></w:rPr></w:pPr><w:r><w:rPr><w:rFonts w:eastAsia="Times New Roman" w:cs="Arial" w:ascii="Century Gothic" w:hAnsi="Century Gothic"/><w:sz w:val="18"/><w:szCs w:val="18"/><w:lang w:val="de-CH" w:eastAsia="en-US"/></w:rPr><w:t>{#positions}{pos}</w:t></w:r></w:p></w:tc><w:tc><w:tcPr><w:tcW w:w="709" w:type="dxa"/><w:tcBorders><w:top w:val="single" w:sz="4" w:space="0" w:color="000000"/><w:start w:val="single" w:sz="4" w:space="0" w:color="000000"/><w:bottom w:val="single" w:sz="4" w:space="0" w:color="000000"/><w:end w:val="single" w:sz="4" w:space="0" w:color="000000"/></w:tcBorders></w:tcPr><w:p><w:pPr><w:pStyle w:val="Normal"/><w:spacing w:lineRule="auto" w:line="240" w:before="0" w:after="0"/><w:jc w:val="center"/><w:rPr><w:rFonts w:ascii="Century Gothic" w:hAnsi="Century Gothic" w:eastAsia="Times New Roman" w:cs="Arial"/><w:sz w:val="18"/><w:szCs w:val="18"/><w:lang w:val="de-CH" w:eastAsia="en-US"/></w:rPr></w:pPr><w:r><w:rPr><w:rFonts w:eastAsia="Times New Roman" w:cs="Arial" w:ascii="Century Gothic" w:hAnsi="Century Gothic"/><w:sz w:val="18"/><w:szCs w:val="18"/><w:lang w:val="de-CH" w:eastAsia="en-US"/></w:rPr><w:t>{hours}</w:t></w:r></w:p></w:tc><w:tc><w:tcPr><w:tcW w:w="709" w:type="dxa"/><w:tcBorders><w:top w:val="single" w:sz="4" w:space="0" w:color="000000"/><w:start w:val="single" w:sz="4" w:space="0" w:color="000000"/><w:bottom w:val="single" w:sz="4" w:space="0" w:color="000000"/><w:end w:val="single" w:sz="4" w:space="0" w:color="000000"/></w:tcBorders></w:tcPr><w:p><w:pPr><w:pStyle w:val="Normal"/><w:spacing w:lineRule="auto" w:line="240" w:before="0" w:after="0"/><w:rPr><w:rFonts w:ascii="Century Gothic" w:hAnsi="Century Gothic" w:eastAsia="Times New Roman" w:cs="Arial"/><w:sz w:val="18"/><w:szCs w:val="18"/><w:lang w:val="de-CH" w:eastAsia="en-US"/></w:rPr></w:pPr><w:r><w:rPr><w:rFonts w:eastAsia="Times New Roman" w:cs="Arial" w:ascii="Century Gothic" w:hAnsi="Century Gothic"/><w:sz w:val="18"/><w:szCs w:val="18"/><w:lang w:val="de-CH" w:eastAsia="en-US"/></w:rPr><w:t>{le}</w:t></w:r></w:p></w:tc><w:tc><w:tcPr><w:tcW w:w="5386" w:type="dxa"/><w:tcBorders><w:top w:val="single" w:sz="4" w:space="0" w:color="000000"/><w:start w:val="single" w:sz="4" w:space="0" w:color="000000"/><w:bottom w:val="single" w:sz="4" w:space="0" w:color="000000"/><w:end w:val="single" w:sz="4" w:space="0" w:color="000000"/></w:tcBorders></w:tcPr><w:p><w:pPr><w:pStyle w:val="Normal"/><w:spacing w:lineRule="auto" w:line="240" w:before="0" w:after="0"/><w:rPr><w:rFonts w:ascii="Century Gothic" w:hAnsi="Century Gothic" w:eastAsia="Times New Roman" w:cs="Arial"/><w:sz w:val="18"/><w:szCs w:val="18"/></w:rPr></w:pPr><w:r><w:rPr><w:rFonts w:eastAsia="Times New Roman" w:cs="Arial" w:ascii="Century Gothic" w:hAnsi="Century Gothic"/><w:b/><w:sz w:val="18"/><w:szCs w:val="18"/></w:rPr><w:t>{spec}</w:t></w:r></w:p></w:tc><w:tc><w:tcPr><w:tcW w:w="994" w:type="dxa"/><w:tcBorders><w:top w:val="single" w:sz="4" w:space="0" w:color="000000"/><w:start w:val="single" w:sz="4" w:space="0" w:color="000000"/><w:bottom w:val="single" w:sz="4" w:space="0" w:color="000000"/><w:end w:val="single" w:sz="4" w:space="0" w:color="000000"/></w:tcBorders></w:tcPr><w:p><w:pPr><w:pStyle w:val="Normal"/><w:tabs><w:tab w:val="clear" w:pos="708"/><w:tab w:val="decimal" w:pos="7088" w:leader="none"/></w:tabs><w:spacing w:lineRule="auto" w:line="240" w:before="0" w:after="0"/><w:jc w:val="center"/><w:rPr><w:rFonts w:ascii="Century Gothic" w:hAnsi="Century Gothic" w:eastAsia="Arial Unicode MS" w:cs="Arial"/><w:sz w:val="18"/><w:szCs w:val="18"/><w:lang w:val="de-CH" w:eastAsia="en-US"/></w:rPr></w:pPr><w:r><w:rPr><w:rFonts w:eastAsia="Arial Unicode MS" w:cs="Arial" w:ascii="Century Gothic" w:hAnsi="Century Gothic"/><w:sz w:val="18"/><w:szCs w:val="18"/><w:lang w:val="de-CH" w:eastAsia="en-US"/></w:rPr><w:t>{ep}</w:t></w:r></w:p></w:tc><w:tc><w:tcPr><w:tcW w:w="1105" w:type="dxa"/><w:tcBorders><w:top w:val="single" w:sz="4" w:space="0" w:color="000000"/><w:start w:val="single" w:sz="4" w:space="0" w:color="000000"/><w:bottom w:val="single" w:sz="4" w:space="0" w:color="000000"/><w:end w:val="single" w:sz="4" w:space="0" w:color="000000"/></w:tcBorders></w:tcPr><w:p><w:pPr><w:pStyle w:val="Normal"/><w:tabs><w:tab w:val="clear" w:pos="708"/><w:tab w:val="decimal" w:pos="8222" w:leader="none"/></w:tabs><w:spacing w:lineRule="auto" w:line="240" w:before="0" w:after="0"/><w:jc w:val="center"/><w:rPr><w:rFonts w:ascii="Century Gothic" w:hAnsi="Century Gothic" w:eastAsia="Arial Unicode MS" w:cs="Arial"/><w:sz w:val="18"/><w:szCs w:val="18"/><w:lang w:val="de-CH" w:eastAsia="en-US"/></w:rPr></w:pPr><w:r><w:rPr><w:rFonts w:eastAsia="Arial Unicode MS" w:cs="Arial" w:ascii="Century Gothic" w:hAnsi="Century Gothic"/><w:sz w:val="18"/><w:szCs w:val="18"/><w:lang w:val="de-CH" w:eastAsia="en-US"/></w:rPr><w:t>{gp}{/positions}</w:t></w:r></w:p></w:tc></w:tr><w:tr><w:tr><w:trPr></w:trPr><w:tc><w:tcPr><w:tcW w:w="8360" w:type="dxa"/><w:gridSpan w:val="5"/><w:tcBorders><w:top w:val="single" w:sz="4" w:space="0" w:color="000000"/><w:start w:val="single" w:sz="4" w:space="0" w:color="000000"/><w:bottom w:val="single" w:sz="4" w:space="0" w:color="000000"/><w:end w:val="single" w:sz="4" w:space="0" w:color="000000"/></w:tcBorders></w:tcPr><w:p><w:pPr><w:pStyle w:val="Normal"/><w:spacing w:lineRule="auto" w:line="240" w:before="0" w:after="0"/><w:rPr><w:rFonts w:ascii="Century Gothic" w:hAnsi="Century Gothic" w:eastAsia="Times New Roman" w:cs="Arial"/><w:b/><w:sz w:val="18"/><w:szCs w:val="18"/><w:lang w:val="de-CH" w:eastAsia="en-US"/></w:rPr></w:pPr><w:r><w:rPr><w:rFonts w:eastAsia="Times New Roman" w:cs="Arial" w:ascii="Century Gothic" w:hAnsi="Century Gothic"/><w:b/><w:sz w:val="18"/><w:szCs w:val="18"/><w:lang w:val="de-CH" w:eastAsia="en-US"/></w:rPr><w:t>Zwischensumme netto in EURO</w:t></w:r></w:p></w:tc><w:tc><w:tcPr><w:tcW w:w="1105" w:type="dxa"/><w:tcBorders><w:top w:val="single" w:sz="4" w:space="0" w:color="000000"/><w:start w:val="single" w:sz="4" w:space="0" w:color="000000"/><w:bottom w:val="single" w:sz="4" w:space="0" w:color="000000"/><w:end w:val="single" w:sz="4" w:space="0" w:color="000000"/></w:tcBorders></w:tcPr><w:p><w:pPr><w:pStyle w:val="Normal"/><w:tabs><w:tab w:val="clear" w:pos="708"/><w:tab w:val="decimal" w:pos="8222" w:leader="none"/></w:tabs><w:spacing w:lineRule="auto" w:line="240" w:before="0" w:after="0"/><w:rPr><w:rFonts w:ascii="Century Gothic" w:hAnsi="Century Gothic" w:eastAsia="Times New Roman" w:cs="Arial"/><w:b/><w:sz w:val="18"/><w:szCs w:val="18"/><w:lang w:val="de-CH" w:eastAsia="en-US"/></w:rPr></w:pPr><w:r><w:rPr><w:rFonts w:eastAsia="Times New Roman" w:cs="Arial" w:ascii="Century Gothic" w:hAnsi="Century Gothic"/><w:b/><w:sz w:val="18"/><w:szCs w:val="18"/><w:lang w:val="de-CH" w:eastAsia="en-US"/></w:rPr><w:t>{netTotal}</w:t></w:r></w:p></w:tc></w:tr><w:tr><w:trPr></w:trPr><w:tc><w:tcPr><w:tcW w:w="8360" w:type="dxa"/><w:gridSpan w:val="5"/><w:tcBorders><w:top w:val="single" w:sz="4" w:space="0" w:color="000000"/><w:start w:val="single" w:sz="4" w:space="0" w:color="000000"/><w:bottom w:val="single" w:sz="4" w:space="0" w:color="000000"/><w:end w:val="single" w:sz="4" w:space="0" w:color="000000"/></w:tcBorders></w:tcPr><w:p><w:pPr><w:pStyle w:val="Normal"/><w:spacing w:lineRule="auto" w:line="240" w:before="0" w:after="0"/><w:rPr><w:rFonts w:ascii="Century Gothic" w:hAnsi="Century Gothic" w:eastAsia="Times New Roman" w:cs="Arial"/><w:b/><w:sz w:val="18"/><w:szCs w:val="18"/><w:lang w:val="de-CH" w:eastAsia="en-US"/></w:rPr></w:pPr><w:r><w:rPr><w:rFonts w:eastAsia="Times New Roman" w:cs="Arial" w:ascii="Century Gothic" w:hAnsi="Century Gothic"/><w:b/><w:sz w:val="18"/><w:szCs w:val="18"/><w:lang w:val="de-CH" w:eastAsia="en-US"/></w:rPr><w:t>Zzgl. 19% Umsatzsteuer</w:t></w:r></w:p></w:tc><w:tc><w:tcPr><w:tcW w:w="1105" w:type="dxa"/><w:tcBorders><w:top w:val="single" w:sz="4" w:space="0" w:color="000000"/><w:start w:val="single" w:sz="4" w:space="0" w:color="000000"/><w:bottom w:val="single" w:sz="4" w:space="0" w:color="000000"/><w:end w:val="single" w:sz="4" w:space="0" w:color="000000"/></w:tcBorders></w:tcPr><w:p><w:pPr><w:pStyle w:val="Normal"/><w:tabs><w:tab w:val="clear" w:pos="708"/><w:tab w:val="decimal" w:pos="8222" w:leader="none"/></w:tabs><w:spacing w:lineRule="auto" w:line="240" w:before="0" w:after="0"/><w:rPr><w:rFonts w:ascii="Century Gothic" w:hAnsi="Century Gothic" w:eastAsia="Times New Roman" w:cs="Arial"/><w:b/><w:sz w:val="18"/><w:szCs w:val="18"/><w:lang w:val="de-CH" w:eastAsia="en-US"/></w:rPr></w:pPr><w:r><w:rPr><w:rFonts w:eastAsia="Times New Roman" w:cs="Arial" w:ascii="Century Gothic" w:hAnsi="Century Gothic"/><w:b/><w:sz w:val="18"/><w:szCs w:val="18"/><w:lang w:val="de-CH" w:eastAsia="en-US"/></w:rPr><w:t>{vatAmount}</w:t></w:r></w:p></w:tc></w:tr><w:tr><w:trPr></w:trPr><w:tc><w:tcPr><w:tcW w:w="8360" w:type="dxa"/><w:gridSpan w:val="5"/><w:tcBorders><w:top w:val="single" w:sz="4" w:space="0" w:color="000000"/><w:start w:val="single" w:sz="4" w:space="0" w:color="000000"/><w:bottom w:val="single" w:sz="4" w:space="0" w:color="000000"/><w:end w:val="single" w:sz="4" w:space="0" w:color="000000"/></w:tcBorders></w:tcPr><w:p><w:pPr><w:pStyle w:val="Normal"/><w:spacing w:lineRule="auto" w:line="240" w:before="0" w:after="0"/><w:rPr><w:rFonts w:ascii="Century Gothic" w:hAnsi="Century Gothic" w:eastAsia="Times New Roman" w:cs="Arial"/><w:b/><w:sz w:val="18"/><w:szCs w:val="18"/><w:lang w:val="de-CH" w:eastAsia="en-US"/></w:rPr></w:pPr><w:r><w:rPr><w:rFonts w:eastAsia="Times New Roman" w:cs="Arial" w:ascii="Century Gothic" w:hAnsi="Century Gothic"/><w:b/><w:sz w:val="18"/><w:szCs w:val="18"/><w:lang w:val="de-CH" w:eastAsia="en-US"/></w:rPr><w:t>Gesamtbetrag brutto in EURO</w:t></w:r></w:p></w:tc><w:tc><w:tcPr><w:tcW w:w="1105" w:type="dxa"/><w:tcBorders><w:top w:val="single" w:sz="4" w:space="0" w:color="000000"/><w:start w:val="single" w:sz="4" w:space="0" w:color="000000"/><w:bottom w:val="single" w:sz="4" w:space="0" w:color="000000"/><w:end w:val="single" w:sz="4" w:space="0" w:color="000000"/></w:tcBorders></w:tcPr><w:p><w:pPr><w:pStyle w:val="Normal"/><w:tabs><w:tab w:val="clear" w:pos="708"/><w:tab w:val="decimal" w:pos="8222" w:leader="none"/></w:tabs><w:spacing w:lineRule="auto" w:line="240" w:before="0" w:after="0"/><w:rPr><w:rFonts w:ascii="Century Gothic" w:hAnsi="Century Gothic" w:eastAsia="Times New Roman" w:cs="Arial"/><w:b/><w:sz w:val="18"/><w:szCs w:val="18"/><w:lang w:val="de-CH" w:eastAsia="en-US"/></w:rPr></w:pPr><w:r><w:rPr><w:rFonts w:eastAsia="Times New Roman" w:cs="Arial" w:ascii="Century Gothic" w:hAnsi="Century Gothic"/><w:b/><w:sz w:val="18"/><w:szCs w:val="18"/><w:lang w:val="de-CH" w:eastAsia="en-US"/></w:rPr><w:t>{grossTotal}</w:t></w:r></w:p></w:tc></w:tr></w:tbl><w:p><w:pPr><w:pStyle w:val="Normal"/><w:spacing w:lineRule="auto" w:line="240" w:before="0" w:after="0"/><w:rPr><w:rFonts w:ascii="Century Gothic" w:hAnsi="Century Gothic" w:eastAsia="Times New Roman" w:cs="Arial"/><w:sz w:val="16"/><w:szCs w:val="16"/></w:rPr></w:pPr><w:r><w:rPr><w:rFonts w:eastAsia="Times New Roman" w:cs="Arial" w:ascii="Century Gothic" w:hAnsi="Century Gothic"/><w:sz w:val="16"/><w:szCs w:val="16"/></w:rPr></w:r></w:p><w:p><w:pPr><w:pStyle w:val="Normal"/><w:spacing w:lineRule="auto" w:line="240" w:before="0" w:after="0"/><w:rPr><w:rFonts w:ascii="Century Gothic" w:hAnsi="Century Gothic" w:eastAsia="Times New Roman" w:cs="Arial"/><w:sz w:val="16"/><w:szCs w:val="16"/></w:rPr></w:pPr><w:r><w:rPr><w:rFonts w:eastAsia="Times New Roman" w:cs="Arial" w:ascii="Century Gothic" w:hAnsi="Century Gothic"/><w:sz w:val="16"/><w:szCs w:val="16"/></w:rPr></w:r></w:p><w:p><w:pPr><w:pStyle w:val="Normal"/><w:spacing w:lineRule="auto" w:line="240" w:before="0" w:after="0"/><w:rPr><w:rFonts w:ascii="Century Gothic" w:hAnsi="Century Gothic" w:eastAsia="Times New Roman" w:cs="Arial"/><w:sz w:val="16"/><w:szCs w:val="16"/></w:rPr></w:pPr><w:r><w:rPr><w:rFonts w:eastAsia="Times New Roman" w:cs="Arial" w:ascii="Century Gothic" w:hAnsi="Century Gothic"/><w:sz w:val="16"/><w:szCs w:val="16"/></w:rPr></w:r></w:p><w:p><w:pPr><w:pStyle w:val="Normal"/><w:spacing w:lineRule="auto" w:line="240" w:before="0" w:after="0"/><w:rPr><w:rFonts w:ascii="Century Gothic" w:hAnsi="Century Gothic" w:eastAsia="Times New Roman" w:cs="Arial"/><w:sz w:val="16"/><w:szCs w:val="16"/></w:rPr></w:pPr><w:r><w:rPr><w:rFonts w:eastAsia="Times New Roman" w:cs="Arial" w:ascii="Century Gothic" w:hAnsi="Century Gothic"/><w:sz w:val="16"/><w:szCs w:val="16"/></w:rPr></w:r></w:p><w:p><w:pPr><w:pStyle w:val="Normal"/><w:spacing w:lineRule="auto" w:line="240" w:before="0" w:after="0"/><w:rPr><w:rFonts w:ascii="Century Gothic" w:hAnsi="Century Gothic" w:eastAsia="Times New Roman" w:cs="Arial"/><w:sz w:val="16"/><w:szCs w:val="16"/></w:rPr></w:pPr><w:r><w:rPr><w:rFonts w:eastAsia="Times New Roman" w:cs="Arial" w:ascii="Century Gothic" w:hAnsi="Century Gothic"/><w:sz w:val="16"/><w:szCs w:val="16"/></w:rPr></w:r></w:p><w:p><w:pPr><w:pStyle w:val="Normal"/><w:spacing w:lineRule="auto" w:line="240" w:before="0" w:after="0"/><w:rPr><w:rFonts w:ascii="Century Gothic" w:hAnsi="Century Gothic" w:eastAsia="Times New Roman" w:cs="Arial"/><w:sz w:val="16"/><w:szCs w:val="16"/></w:rPr></w:pPr><w:r><w:rPr><w:rFonts w:eastAsia="Times New Roman" w:cs="Arial" w:ascii="Century Gothic" w:hAnsi="Century Gothic"/><w:sz w:val="16"/><w:szCs w:val="16"/></w:rPr></w:r></w:p><w:p><w:pPr><w:pStyle w:val="Normal"/><w:spacing w:lineRule="auto" w:line="240" w:before="0" w:after="0"/><w:rPr><w:rFonts w:ascii="Century Gothic" w:hAnsi="Century Gothic" w:eastAsia="Times New Roman" w:cs="Arial"/><w:b/><w:sz w:val="20"/><w:szCs w:val="20"/></w:rPr></w:pPr><w:r><w:rPr><w:rFonts w:eastAsia="Times New Roman" w:cs="Arial" w:ascii="Century Gothic" w:hAnsi="Century Gothic"/><w:b/><w:sz w:val="20"/><w:szCs w:val="20"/></w:rPr><w:t>Zahlbar bis zum {payUntil} ohne Abzug. Vielen Dank für Ihren Auftrag!</w:t></w:r></w:p><w:p><w:pPr><w:pStyle w:val="Normal"/><w:spacing w:lineRule="auto" w:line="240" w:before="0" w:after="0"/><w:rPr><w:rFonts w:ascii="Century Gothic" w:hAnsi="Century Gothic" w:eastAsia="Times New Roman" w:cs="Arial"/><w:b/><w:sz w:val="20"/><w:szCs w:val="20"/></w:rPr></w:pPr><w:r><w:rPr><w:rFonts w:eastAsia="Times New Roman" w:cs="Arial" w:ascii="Century Gothic" w:hAnsi="Century Gothic"/><w:b/><w:sz w:val="20"/><w:szCs w:val="20"/></w:rPr></w:r></w:p><w:p><w:pPr><w:pStyle w:val="Normal"/><w:spacing w:lineRule="auto" w:line="240" w:before="0" w:after="0"/><w:rPr><w:rFonts w:ascii="Century Gothic" w:hAnsi="Century Gothic" w:eastAsia="Times New Roman" w:cs="Arial"/><w:b/><w:sz w:val="20"/><w:szCs w:val="20"/></w:rPr></w:pPr><w:r><w:rPr><w:rFonts w:eastAsia="Times New Roman" w:cs="Arial" w:ascii="Century Gothic" w:hAnsi="Century Gothic"/><w:b/><w:sz w:val="20"/><w:szCs w:val="20"/></w:rPr></w:r></w:p><w:p><w:pPr><w:pStyle w:val="Normal"/><w:spacing w:lineRule="auto" w:line="240" w:before="0" w:after="0"/><w:rPr><w:rFonts w:ascii="Century Gothic" w:hAnsi="Century Gothic" w:eastAsia="Times New Roman" w:cs="Arial"/><w:b/><w:sz w:val="20"/><w:szCs w:val="20"/></w:rPr></w:pPr><w:r><w:rPr><w:rFonts w:eastAsia="Times New Roman" w:cs="Arial" w:ascii="Century Gothic" w:hAnsi="Century Gothic"/><w:b/><w:sz w:val="20"/><w:szCs w:val="20"/></w:rPr><w:t xml:space="preserve"> </w:t></w:r></w:p><w:p><w:pPr><w:pStyle w:val="Normal"/><w:spacing w:before="0" w:after="200"/><w:rPr><w:rFonts w:ascii="Arial" w:hAnsi="Arial" w:cs="Arial"/></w:rPr></w:pPr><w:r><w:rPr><w:rFonts w:cs="Arial" w:ascii="Arial" w:hAnsi="Arial"/></w:rPr></w:r></w:p><w:sectPr><w:headerReference w:type="even" r:id="rId3"/><w:headerReference w:type="default" r:id="rId4"/><w:headerReference w:type="first" r:id="rId5"/><w:footerReference w:type="even" r:id="rId6"/><w:footerReference w:type="default" r:id="rId7"/><w:footerReference w:type="first" r:id="rId8"/><w:type w:val="nextPage"/><w:pgSz w:w="11906" w:h="16838"/><w:pgMar w:left="1418" w:right="964" w:gutter="0" w:header="709" w:top="1418" w:footer="709" w:bottom="1134"/><w:pgNumType w:fmt="decimal"/><w:formProt w:val="false"/><w:textDirection w:val="lrTb"/><w:docGrid w:type="default" w:linePitch="360" w:charSpace="0"/></w:sectPr></w:body></w:document>
+<file path=word/document.xml><?xml version="1.0" encoding="utf-8"?>
+<w:document xmlns:o="urn:schemas-microsoft-com:office:office" xmlns:r="http://schemas.openxmlformats.org/officeDocument/2006/relationships" xmlns:v="urn:schemas-microsoft-com:vml" xmlns:w="http://schemas.openxmlformats.org/wordprocessingml/2006/main" xmlns:w10="urn:schemas-microsoft-com:office:word" xmlns:wp="http://schemas.openxmlformats.org/drawingml/2006/wordprocessingDrawing" xmlns:pic="http://schemas.openxmlformats.org/drawingml/2006/picture" xmlns:wps="http://schemas.microsoft.com/office/word/2010/wordprocessingShape" xmlns:wpg="http://schemas.microsoft.com/office/word/2010/wordprocessingGroup" xmlns:mc="http://schemas.openxmlformats.org/markup-compatibility/2006" xmlns:wp14="http://schemas.microsoft.com/office/word/2010/wordprocessingDrawing" xmlns:w14="http://schemas.microsoft.com/office/word/2010/wordml" xmlns:w15="http://schemas.microsoft.com/office/word/2012/wordml" mc:Ignorable="w14 wp14 w15">
+  <w:body>
+    <w:p>
+      <w:pPr>
+        <w:pStyle w:val="Normal"/>
+        <w:tabs>
+          <w:tab w:val="clear" w:pos="708"/>
+          <w:tab w:val="left" w:pos="924" w:leader="none"/>
+        </w:tabs>
+        <w:rPr>
+          <w:rFonts w:ascii="Arial" w:hAnsi="Arial" w:cs="Arial"/>
+        </w:rPr>
+      </w:pPr>
+      <w:r>
+        <w:rPr>
+          <w:rFonts w:cs="Arial" w:ascii="Arial" w:hAnsi="Arial"/>
+        </w:rPr>
+        <w:softHyphen/>
+        <w:softHyphen/>
+      </w:r>
+    </w:p>
+    <w:p>
+      <w:pPr>
+        <w:pStyle w:val="Normal"/>
+        <w:tabs>
+          <w:tab w:val="clear" w:pos="708"/>
+          <w:tab w:val="left" w:pos="924" w:leader="none"/>
+        </w:tabs>
+        <w:rPr>
+          <w:b/>
+          <w:color w:val="FF0000"/>
+        </w:rPr>
+      </w:pPr>
+      <w:r>
+        <w:rPr>
+          <w:b/>
+          <w:color w:val="FF0000"/>
+        </w:rPr>
+      </w:r>
+    </w:p>
+    <w:p>
+      <w:pPr>
+        <w:pStyle w:val="Normal"/>
+        <w:spacing w:lineRule="auto" w:line="240" w:before="0" w:after="0"/>
+        <w:rPr/>
+      </w:pPr>
+      <w:r>
+        <w:rPr/>
+      </w:r>
+    </w:p>
+    <w:p>
+      <w:pPr>
+        <w:pStyle w:val="Normal"/>
+        <w:spacing w:lineRule="auto" w:line="240" w:before="0" w:after="0"/>
+        <w:rPr>
+          <w:rFonts w:ascii="Century Gothic" w:hAnsi="Century Gothic" w:eastAsia="Times New Roman" w:cs="Arial"/>
+          <w:sz w:val="16"/>
+          <w:szCs w:val="16"/>
+        </w:rPr>
+      </w:pPr>
+      <w:r>
+        <w:rPr>
+          <w:rFonts w:eastAsia="Times New Roman" w:cs="Arial" w:ascii="Century Gothic" w:hAnsi="Century Gothic"/>
+          <w:sz w:val="16"/>
+          <w:szCs w:val="16"/>
+        </w:rPr>
+      </w:r>
+    </w:p>
+    <w:p>
+      <w:pPr>
+        <w:pStyle w:val="Normal"/>
+        <w:spacing w:lineRule="auto" w:line="240" w:before="0" w:after="0"/>
+        <w:rPr>
+          <w:rFonts w:ascii="Century Gothic" w:hAnsi="Century Gothic" w:eastAsia="Times New Roman" w:cs="Arial"/>
+          <w:sz w:val="18"/>
+          <w:szCs w:val="18"/>
+        </w:rPr>
+      </w:pPr>
+      <w:r>
+        <w:rPr>
+          <w:rFonts w:eastAsia="Times New Roman" w:cs="Arial"/>
+          <w:sz w:val="12"/>
+          <w:szCs w:val="12"/>
+        </w:rPr>
+        <w:t>Heinrich Professional Consultant Network GmbH • Egeriaplatz 3 • 72074 Tübingen</w:t>
+      </w:r>
+      <w:r>
+        <w:rPr>
+          <w:rFonts w:eastAsia="Times New Roman" w:cs="Arial" w:ascii="Century Gothic" w:hAnsi="Century Gothic"/>
+          <w:sz w:val="18"/>
+          <w:szCs w:val="18"/>
+        </w:rPr>
+        <w:tab/>
+        <w:tab/>
+        <w:tab/>
+        <w:tab/>
+      </w:r>
+    </w:p>
+    <w:p>
+      <w:pPr>
+        <w:pStyle w:val="Normal"/>
+        <w:spacing w:lineRule="auto" w:line="240" w:before="0" w:after="0"/>
+        <w:rPr>
+          <w:rFonts w:ascii="Century Gothic" w:hAnsi="Century Gothic" w:eastAsia="Times New Roman" w:cs="Arial"/>
+          <w:sz w:val="16"/>
+          <w:szCs w:val="16"/>
+        </w:rPr>
+      </w:pPr>
+      <w:r>
+        <w:rPr>
+          <w:rFonts w:eastAsia="Times New Roman" w:cs="Arial" w:ascii="Century Gothic" w:hAnsi="Century Gothic"/>
+          <w:sz w:val="16"/>
+          <w:szCs w:val="16"/>
+        </w:rPr>
+      </w:r>
+    </w:p>
+    <w:p>
+      <w:pPr>
+        <w:pStyle w:val="Normal"/>
+        <w:numPr>
+          <w:ilvl w:val="0"/>
+          <w:numId w:val="0"/>
+        </w:numPr>
+        <w:spacing w:lineRule="auto" w:line="240" w:before="0" w:after="0"/>
+        <w:outlineLvl w:val="0"/>
+        <w:rPr>
+          <w:rFonts w:ascii="Century Gothic" w:hAnsi="Century Gothic" w:eastAsia="Times New Roman" w:cs="Arial"/>
+          <w:sz w:val="18"/>
+          <w:szCs w:val="18"/>
+        </w:rPr>
+      </w:pPr>
+      <w:r>
+        <w:rPr>
+          <w:rFonts w:eastAsia="Times New Roman" w:cs="Arial" w:ascii="Century Gothic" w:hAnsi="Century Gothic"/>
+          <w:sz w:val="18"/>
+          <w:szCs w:val="18"/>
+        </w:rPr>
+        <w:t>Göhrum Fahrzeugteile GmbH</w:t>
+      </w:r>
+    </w:p>
+    <w:p>
+      <w:pPr>
+        <w:pStyle w:val="Normal"/>
+        <w:numPr>
+          <w:ilvl w:val="0"/>
+          <w:numId w:val="0"/>
+        </w:numPr>
+        <w:spacing w:lineRule="auto" w:line="240" w:before="0" w:after="0"/>
+        <w:outlineLvl w:val="0"/>
+        <w:rPr>
+          <w:rFonts w:ascii="Century Gothic" w:hAnsi="Century Gothic" w:eastAsia="Times New Roman" w:cs="Arial"/>
+          <w:sz w:val="18"/>
+          <w:szCs w:val="18"/>
+        </w:rPr>
+      </w:pPr>
+      <w:r>
+        <w:rPr>
+          <w:rFonts w:eastAsia="Times New Roman" w:cs="Arial" w:ascii="Century Gothic" w:hAnsi="Century Gothic"/>
+          <w:sz w:val="18"/>
+          <w:szCs w:val="18"/>
+        </w:rPr>
+        <w:t>Ulmenstraße 19</w:t>
+      </w:r>
+    </w:p>
+    <w:p>
+      <w:pPr>
+        <w:pStyle w:val="Normal"/>
+        <w:spacing w:lineRule="auto" w:line="240" w:before="0" w:after="0"/>
+        <w:rPr>
+          <w:rFonts w:ascii="Century Gothic" w:hAnsi="Century Gothic" w:eastAsia="Times New Roman" w:cs="Arial"/>
+          <w:b/>
+          <w:sz w:val="20"/>
+          <w:szCs w:val="20"/>
+        </w:rPr>
+      </w:pPr>
+      <w:r>
+        <w:rPr>
+          <w:rFonts w:eastAsia="Times New Roman" w:cs="Arial" w:ascii="Century Gothic" w:hAnsi="Century Gothic"/>
+          <w:sz w:val="18"/>
+          <w:szCs w:val="18"/>
+        </w:rPr>
+        <w:t>71069 Sindelfingen</w:t>
+        <w:tab/>
+        <w:tab/>
+        <w:tab/>
+        <w:tab/>
+        <w:tab/>
+        <w:tab/>
+        <w:tab/>
+        <w:tab/>
+      </w:r>
+      <w:r>
+        <w:rPr>
+          <w:rFonts w:eastAsia="Times New Roman" w:cs="Arial" w:ascii="Century Gothic" w:hAnsi="Century Gothic"/>
+          <w:b/>
+          <w:sz w:val="20"/>
+          <w:szCs w:val="20"/>
+        </w:rPr>
+        <w:t xml:space="preserve">Datum: </w:t>
+      </w:r>
+      <w:r>
+        <w:rPr>
+          <w:rFonts w:eastAsia="Times New Roman" w:cs="Arial" w:ascii="Century Gothic" w:hAnsi="Century Gothic"/>
+          <w:b/>
+          <w:sz w:val="20"/>
+          <w:szCs w:val="20"/>
+        </w:rPr>
+        <w:t>{invoiceDate}</w:t>
+      </w:r>
+      <w:r>
+        <w:rPr>
+          <w:rFonts w:eastAsia="Times New Roman" w:cs="Arial" w:ascii="Century Gothic" w:hAnsi="Century Gothic"/>
+          <w:b/>
+          <w:sz w:val="20"/>
+          <w:szCs w:val="20"/>
+        </w:rPr>
+        <w:tab/>
+      </w:r>
+    </w:p>
+    <w:p>
+      <w:pPr>
+        <w:pStyle w:val="Normal"/>
+        <w:spacing w:lineRule="auto" w:line="240" w:before="0" w:after="0"/>
+        <w:rPr>
+          <w:rFonts w:ascii="Century Gothic" w:hAnsi="Century Gothic" w:eastAsia="Times New Roman" w:cs="Arial"/>
+          <w:sz w:val="18"/>
+          <w:szCs w:val="18"/>
+        </w:rPr>
+      </w:pPr>
+      <w:r>
+        <w:rPr>
+          <w:rFonts w:eastAsia="Times New Roman" w:cs="Arial" w:ascii="Century Gothic" w:hAnsi="Century Gothic"/>
+          <w:sz w:val="18"/>
+          <w:szCs w:val="18"/>
+        </w:rPr>
+        <w:tab/>
+        <w:tab/>
+        <w:tab/>
+        <w:tab/>
+        <w:tab/>
+        <w:tab/>
+        <w:tab/>
+        <w:tab/>
+        <w:tab/>
+        <w:tab/>
+      </w:r>
+    </w:p>
+    <w:p>
+      <w:pPr>
+        <w:pStyle w:val="Normal"/>
+        <w:spacing w:lineRule="auto" w:line="240" w:before="0" w:after="0"/>
+        <w:rPr>
+          <w:rFonts w:ascii="Century Gothic" w:hAnsi="Century Gothic" w:eastAsia="Times New Roman" w:cs="Arial"/>
+          <w:sz w:val="16"/>
+          <w:szCs w:val="16"/>
+        </w:rPr>
+      </w:pPr>
+      <w:r>
+        <w:rPr>
+          <w:rFonts w:eastAsia="Times New Roman" w:cs="Arial" w:ascii="Century Gothic" w:hAnsi="Century Gothic"/>
+          <w:sz w:val="16"/>
+          <w:szCs w:val="16"/>
+        </w:rPr>
+      </w:r>
+    </w:p>
+    <w:p>
+      <w:pPr>
+        <w:pStyle w:val="Normal"/>
+        <w:numPr>
+          <w:ilvl w:val="0"/>
+          <w:numId w:val="0"/>
+        </w:numPr>
+        <w:spacing w:lineRule="auto" w:line="240" w:before="0" w:after="0"/>
+        <w:ind w:firstLine="708" w:start="6372"/>
+        <w:outlineLvl w:val="0"/>
+        <w:rPr>
+          <w:rFonts w:ascii="Century Gothic" w:hAnsi="Century Gothic" w:eastAsia="Times New Roman" w:cs="Arial"/>
+          <w:b/>
+          <w:color w:val="4D4D4D"/>
+          <w:sz w:val="16"/>
+          <w:szCs w:val="16"/>
+          <w:u w:val="single"/>
+        </w:rPr>
+      </w:pPr>
+      <w:r>
+        <w:rPr>
+          <w:rFonts w:eastAsia="Times New Roman" w:cs="Arial" w:ascii="Century Gothic" w:hAnsi="Century Gothic"/>
+          <w:b/>
+          <w:color w:val="4D4D4D"/>
+          <w:sz w:val="16"/>
+          <w:szCs w:val="16"/>
+          <w:u w:val="single"/>
+        </w:rPr>
+        <w:t>Bestell-/Auftragsdaten:</w:t>
+      </w:r>
+    </w:p>
+    <w:p>
+      <w:pPr>
+        <w:pStyle w:val="Normal"/>
+        <w:numPr>
+          <w:ilvl w:val="0"/>
+          <w:numId w:val="0"/>
+        </w:numPr>
+        <w:spacing w:lineRule="auto" w:line="240" w:before="0" w:after="0"/>
+        <w:outlineLvl w:val="0"/>
+        <w:rPr>
+          <w:rFonts w:ascii="Century Gothic" w:hAnsi="Century Gothic" w:eastAsia="Times New Roman" w:cs="Arial"/>
+          <w:color w:val="4D4D4D"/>
+          <w:sz w:val="16"/>
+          <w:szCs w:val="16"/>
+        </w:rPr>
+      </w:pPr>
+      <w:r>
+        <w:rPr>
+          <w:rFonts w:eastAsia="Times New Roman" w:cs="Arial" w:ascii="Century Gothic" w:hAnsi="Century Gothic"/>
+          <w:color w:val="4D4D4D"/>
+          <w:sz w:val="16"/>
+          <w:szCs w:val="16"/>
+        </w:rPr>
+        <w:tab/>
+        <w:tab/>
+        <w:tab/>
+        <w:tab/>
+        <w:tab/>
+        <w:tab/>
+        <w:tab/>
+        <w:tab/>
+        <w:tab/>
+        <w:tab/>
+        <w:t xml:space="preserve">Besteller: </w:t>
+      </w:r>
+    </w:p>
+    <w:p>
+      <w:pPr>
+        <w:pStyle w:val="Normal"/>
+        <w:numPr>
+          <w:ilvl w:val="0"/>
+          <w:numId w:val="0"/>
+        </w:numPr>
+        <w:spacing w:lineRule="auto" w:line="240" w:before="0" w:after="0"/>
+        <w:outlineLvl w:val="0"/>
+        <w:rPr>
+          <w:rFonts w:ascii="Century Gothic" w:hAnsi="Century Gothic" w:eastAsia="Times New Roman" w:cs="Arial"/>
+          <w:color w:val="4D4D4D"/>
+          <w:sz w:val="16"/>
+          <w:szCs w:val="16"/>
+        </w:rPr>
+      </w:pPr>
+      <w:r>
+        <w:rPr>
+          <w:rFonts w:eastAsia="Times New Roman" w:cs="Arial" w:ascii="Century Gothic" w:hAnsi="Century Gothic"/>
+          <w:color w:val="4D4D4D"/>
+          <w:sz w:val="16"/>
+          <w:szCs w:val="16"/>
+        </w:rPr>
+        <w:tab/>
+        <w:tab/>
+        <w:tab/>
+        <w:tab/>
+        <w:tab/>
+        <w:tab/>
+        <w:tab/>
+        <w:tab/>
+        <w:tab/>
+        <w:tab/>
+        <w:t>Ihre Ust-ID: DE145144224</w:t>
+      </w:r>
+    </w:p>
+    <w:p>
+      <w:pPr>
+        <w:pStyle w:val="Normal"/>
+        <w:numPr>
+          <w:ilvl w:val="0"/>
+          <w:numId w:val="0"/>
+        </w:numPr>
+        <w:spacing w:lineRule="auto" w:line="240" w:before="0" w:after="0"/>
+        <w:outlineLvl w:val="0"/>
+        <w:rPr>
+          <w:rFonts w:ascii="Century Gothic" w:hAnsi="Century Gothic" w:eastAsia="Times New Roman" w:cs="Arial"/>
+          <w:b/>
+          <w:bCs/>
+          <w:color w:val="4D4D4D"/>
+          <w:sz w:val="16"/>
+          <w:szCs w:val="16"/>
+        </w:rPr>
+      </w:pPr>
+      <w:r>
+        <w:rPr>
+          <w:rFonts w:eastAsia="Times New Roman" w:cs="Arial" w:ascii="Century Gothic" w:hAnsi="Century Gothic"/>
+          <w:color w:val="4D4D4D"/>
+          <w:sz w:val="16"/>
+          <w:szCs w:val="16"/>
+        </w:rPr>
+        <w:tab/>
+        <w:tab/>
+        <w:tab/>
+        <w:tab/>
+        <w:tab/>
+        <w:tab/>
+        <w:tab/>
+        <w:tab/>
+        <w:tab/>
+        <w:tab/>
+      </w:r>
+      <w:r>
+        <w:rPr>
+          <w:rFonts w:eastAsia="Times New Roman" w:cs="Arial" w:ascii="Century Gothic" w:hAnsi="Century Gothic"/>
+          <w:b/>
+          <w:bCs/>
+          <w:color w:val="4D4D4D"/>
+          <w:sz w:val="16"/>
+          <w:szCs w:val="16"/>
+        </w:rPr>
+        <w:t>Kd.-Nr.: 10602</w:t>
+      </w:r>
+    </w:p>
+    <w:p>
+      <w:pPr>
+        <w:pStyle w:val="Normal"/>
+        <w:spacing w:lineRule="auto" w:line="240" w:before="0" w:after="0"/>
+        <w:rPr>
+          <w:rFonts w:ascii="Century Gothic" w:hAnsi="Century Gothic" w:eastAsia="Times New Roman" w:cs="Arial"/>
+          <w:sz w:val="18"/>
+          <w:szCs w:val="18"/>
+        </w:rPr>
+      </w:pPr>
+      <w:r>
+        <w:rPr>
+          <w:rFonts w:eastAsia="Times New Roman" w:cs="Arial" w:ascii="Century Gothic" w:hAnsi="Century Gothic"/>
+          <w:sz w:val="18"/>
+          <w:szCs w:val="18"/>
+        </w:rPr>
+      </w:r>
+    </w:p>
+    <w:p>
+      <w:pPr>
+        <w:pStyle w:val="Normal"/>
+        <w:numPr>
+          <w:ilvl w:val="0"/>
+          <w:numId w:val="0"/>
+        </w:numPr>
+        <w:spacing w:lineRule="auto" w:line="240" w:before="0" w:after="0"/>
+        <w:outlineLvl w:val="0"/>
+        <w:rPr>
+          <w:rFonts w:ascii="Century Gothic" w:hAnsi="Century Gothic" w:eastAsia="Times New Roman" w:cs="Arial"/>
+          <w:b/>
+          <w:color w:val="4D4D4D"/>
+          <w:sz w:val="16"/>
+          <w:szCs w:val="16"/>
+          <w:u w:val="single"/>
+        </w:rPr>
+      </w:pPr>
+      <w:r>
+        <w:rPr>
+          <w:rFonts w:eastAsia="Times New Roman" w:cs="Arial" w:ascii="Century Gothic" w:hAnsi="Century Gothic"/>
+          <w:color w:val="4D4D4D"/>
+          <w:sz w:val="16"/>
+          <w:szCs w:val="16"/>
+        </w:rPr>
+        <w:tab/>
+        <w:tab/>
+        <w:tab/>
+        <w:tab/>
+        <w:tab/>
+        <w:tab/>
+        <w:tab/>
+        <w:tab/>
+        <w:tab/>
+        <w:tab/>
+      </w:r>
+      <w:r>
+        <w:rPr>
+          <w:rFonts w:eastAsia="Times New Roman" w:cs="Arial" w:ascii="Century Gothic" w:hAnsi="Century Gothic"/>
+          <w:b/>
+          <w:color w:val="4D4D4D"/>
+          <w:sz w:val="16"/>
+          <w:szCs w:val="16"/>
+          <w:u w:val="single"/>
+        </w:rPr>
+        <w:t>Bei Rückfragen:</w:t>
+      </w:r>
+    </w:p>
+    <w:p>
+      <w:pPr>
+        <w:pStyle w:val="Normal"/>
+        <w:numPr>
+          <w:ilvl w:val="0"/>
+          <w:numId w:val="0"/>
+        </w:numPr>
+        <w:spacing w:lineRule="auto" w:line="240" w:before="0" w:after="0"/>
+        <w:outlineLvl w:val="0"/>
+        <w:rPr>
+          <w:rFonts w:ascii="Century Gothic" w:hAnsi="Century Gothic" w:eastAsia="Times New Roman" w:cs="Arial"/>
+          <w:color w:val="4D4D4D"/>
+          <w:sz w:val="16"/>
+          <w:szCs w:val="16"/>
+        </w:rPr>
+      </w:pPr>
+      <w:r>
+        <w:rPr>
+          <w:rFonts w:eastAsia="Times New Roman" w:cs="Arial" w:ascii="Century Gothic" w:hAnsi="Century Gothic"/>
+          <w:color w:val="4D4D4D"/>
+          <w:sz w:val="16"/>
+          <w:szCs w:val="16"/>
+        </w:rPr>
+        <w:tab/>
+        <w:tab/>
+        <w:tab/>
+        <w:tab/>
+        <w:tab/>
+        <w:tab/>
+        <w:tab/>
+        <w:tab/>
+        <w:tab/>
+        <w:tab/>
+        <w:t>Herr Wolfgang Heinrich</w:t>
+      </w:r>
+    </w:p>
+    <w:p>
+      <w:pPr>
+        <w:pStyle w:val="Normal"/>
+        <w:numPr>
+          <w:ilvl w:val="0"/>
+          <w:numId w:val="0"/>
+        </w:numPr>
+        <w:spacing w:lineRule="auto" w:line="240" w:before="0" w:after="0"/>
+        <w:outlineLvl w:val="0"/>
+        <w:rPr>
+          <w:rFonts w:ascii="Century Gothic" w:hAnsi="Century Gothic" w:eastAsia="Times New Roman" w:cs="Arial"/>
+          <w:color w:val="4D4D4D"/>
+          <w:sz w:val="16"/>
+          <w:szCs w:val="16"/>
+          <w:lang w:val="en-US"/>
+        </w:rPr>
+      </w:pPr>
+      <w:r>
+        <w:rPr>
+          <w:rFonts w:eastAsia="Times New Roman" w:cs="Arial" w:ascii="Century Gothic" w:hAnsi="Century Gothic"/>
+          <w:color w:val="4D4D4D"/>
+          <w:sz w:val="16"/>
+          <w:szCs w:val="16"/>
+        </w:rPr>
+        <w:tab/>
+        <w:tab/>
+        <w:tab/>
+        <w:tab/>
+        <w:tab/>
+        <w:tab/>
+        <w:tab/>
+        <w:tab/>
+        <w:tab/>
+        <w:tab/>
+      </w:r>
+      <w:r>
+        <w:rPr>
+          <w:rFonts w:eastAsia="Times New Roman" w:cs="Arial" w:ascii="Century Gothic" w:hAnsi="Century Gothic"/>
+          <w:color w:val="4D4D4D"/>
+          <w:sz w:val="16"/>
+          <w:szCs w:val="16"/>
+          <w:lang w:val="en-US"/>
+        </w:rPr>
+        <w:t>Tel.: 0049 7071 13 5 66-24</w:t>
+      </w:r>
+    </w:p>
+    <w:p>
+      <w:pPr>
+        <w:pStyle w:val="Normal"/>
+        <w:numPr>
+          <w:ilvl w:val="0"/>
+          <w:numId w:val="0"/>
+        </w:numPr>
+        <w:spacing w:lineRule="auto" w:line="240" w:before="0" w:after="0"/>
+        <w:outlineLvl w:val="0"/>
+        <w:rPr>
+          <w:rFonts w:ascii="Century Gothic" w:hAnsi="Century Gothic" w:eastAsia="Times New Roman" w:cs="Arial"/>
+          <w:color w:val="4D4D4D"/>
+          <w:sz w:val="16"/>
+          <w:szCs w:val="16"/>
+          <w:lang w:val="en-US"/>
+        </w:rPr>
+      </w:pPr>
+      <w:r>
+        <w:rPr>
+          <w:rFonts w:eastAsia="Times New Roman" w:cs="Arial" w:ascii="Century Gothic" w:hAnsi="Century Gothic"/>
+          <w:color w:val="4D4D4D"/>
+          <w:sz w:val="16"/>
+          <w:szCs w:val="16"/>
+          <w:lang w:val="en-US"/>
+        </w:rPr>
+        <w:tab/>
+        <w:tab/>
+        <w:tab/>
+        <w:tab/>
+        <w:tab/>
+        <w:tab/>
+        <w:tab/>
+        <w:tab/>
+        <w:tab/>
+        <w:tab/>
+        <w:t>Mail: heinrich@h-pcn.de</w:t>
+      </w:r>
+    </w:p>
+    <w:p>
+      <w:pPr>
+        <w:pStyle w:val="Normal"/>
+        <w:spacing w:lineRule="auto" w:line="240" w:before="0" w:after="0"/>
+        <w:rPr>
+          <w:rFonts w:ascii="Century Gothic" w:hAnsi="Century Gothic" w:eastAsia="Times New Roman" w:cs="Arial"/>
+          <w:b/>
+          <w:sz w:val="24"/>
+          <w:szCs w:val="24"/>
+          <w:lang w:val="en-US"/>
+        </w:rPr>
+      </w:pPr>
+      <w:r>
+        <w:rPr>
+          <w:rFonts w:eastAsia="Times New Roman" w:cs="Arial" w:ascii="Century Gothic" w:hAnsi="Century Gothic"/>
+          <w:b/>
+          <w:sz w:val="24"/>
+          <w:szCs w:val="24"/>
+          <w:lang w:val="en-US"/>
+        </w:rPr>
+      </w:r>
+    </w:p>
+    <w:p>
+      <w:pPr>
+        <w:pStyle w:val="Normal"/>
+        <w:spacing w:lineRule="auto" w:line="240" w:before="0" w:after="0"/>
+        <w:rPr>
+          <w:rFonts w:ascii="Century Gothic" w:hAnsi="Century Gothic" w:eastAsia="Times New Roman" w:cs="Arial"/>
+          <w:b/>
+          <w:sz w:val="18"/>
+          <w:szCs w:val="18"/>
+        </w:rPr>
+      </w:pPr>
+      <w:r>
+        <w:rPr>
+          <w:rFonts w:eastAsia="Times New Roman" w:cs="Arial" w:ascii="Century Gothic" w:hAnsi="Century Gothic"/>
+          <w:b/>
+          <w:sz w:val="24"/>
+          <w:szCs w:val="24"/>
+        </w:rPr>
+        <w:t>Rechnungs-Nr.: {invoiceNumber}</w:t>
+        <w:tab/>
+        <w:tab/>
+        <w:tab/>
+        <w:tab/>
+        <w:tab/>
+        <w:tab/>
+        <w:tab/>
+      </w:r>
+      <w:r>
+        <w:rPr>
+          <w:rFonts w:eastAsia="Times New Roman" w:cs="Arial" w:ascii="Century Gothic" w:hAnsi="Century Gothic"/>
+          <w:b/>
+          <w:sz w:val="18"/>
+          <w:szCs w:val="18"/>
+        </w:rPr>
+        <w:t>Projekt: {projectTitle}</w:t>
+      </w:r>
+    </w:p>
+    <w:p>
+      <w:pPr>
+        <w:pStyle w:val="Normal"/>
+        <w:spacing w:lineRule="auto" w:line="240" w:before="0" w:after="0"/>
+        <w:rPr>
+          <w:rFonts w:ascii="Century Gothic" w:hAnsi="Century Gothic" w:eastAsia="Times New Roman" w:cs="Arial"/>
+          <w:b/>
+          <w:sz w:val="18"/>
+          <w:szCs w:val="18"/>
+        </w:rPr>
+      </w:pPr>
+      <w:r>
+        <w:rPr>
+          <w:rFonts w:eastAsia="Times New Roman" w:cs="Arial" w:ascii="Century Gothic" w:hAnsi="Century Gothic"/>
+          <w:b/>
+          <w:sz w:val="18"/>
+          <w:szCs w:val="18"/>
+        </w:rPr>
+      </w:r>
+    </w:p>
+    <w:p>
+      <w:pPr>
+        <w:pStyle w:val="Normal"/>
+        <w:tabs>
+          <w:tab w:val="left" w:pos="708" w:leader="none"/>
+          <w:tab w:val="left" w:pos="1416" w:leader="none"/>
+          <w:tab w:val="left" w:pos="2124" w:leader="none"/>
+          <w:tab w:val="left" w:pos="2832" w:leader="none"/>
+          <w:tab w:val="left" w:pos="3540" w:leader="none"/>
+          <w:tab w:val="left" w:pos="4248" w:leader="none"/>
+          <w:tab w:val="left" w:pos="5080" w:leader="none"/>
+        </w:tabs>
+        <w:spacing w:lineRule="auto" w:line="240" w:before="0" w:after="0"/>
+        <w:rPr>
+          <w:rFonts w:ascii="Century Gothic" w:hAnsi="Century Gothic" w:eastAsia="Times New Roman" w:cs="Arial"/>
+          <w:b/>
+          <w:sz w:val="16"/>
+          <w:szCs w:val="16"/>
+        </w:rPr>
+      </w:pPr>
+      <w:r>
+        <w:rPr>
+          <w:rFonts w:eastAsia="Times New Roman" w:cs="Arial" w:ascii="Century Gothic" w:hAnsi="Century Gothic"/>
+          <w:b/>
+          <w:sz w:val="16"/>
+          <w:szCs w:val="16"/>
+        </w:rPr>
+        <w:t xml:space="preserve">Rechnung per E-Mail an: </w:t>
+      </w:r>
+      <w:hyperlink r:id="rId2">
+        <w:r>
+          <w:rPr>
+            <w:rStyle w:val="Hyperlink"/>
+            <w:rFonts w:eastAsia="Times New Roman" w:cs="Arial" w:ascii="Century Gothic" w:hAnsi="Century Gothic"/>
+            <w:b/>
+            <w:sz w:val="16"/>
+            <w:szCs w:val="16"/>
+          </w:rPr>
+          <w:t>matthias.meltsch@goehrum-teile.com</w:t>
+        </w:r>
+      </w:hyperlink>
+    </w:p>
+    <w:p>
+      <w:pPr>
+        <w:pStyle w:val="Normal"/>
+        <w:spacing w:lineRule="auto" w:line="240" w:before="0" w:after="0"/>
+        <w:rPr>
+          <w:rFonts w:ascii="Century Gothic" w:hAnsi="Century Gothic" w:eastAsia="Times New Roman" w:cs="Arial"/>
+          <w:b/>
+        </w:rPr>
+      </w:pPr>
+      <w:r>
+        <w:rPr>
+          <w:rFonts w:eastAsia="Times New Roman" w:cs="Arial" w:ascii="Century Gothic" w:hAnsi="Century Gothic"/>
+          <w:b/>
+        </w:rPr>
+      </w:r>
+    </w:p>
+    <w:p>
+      <w:pPr>
+        <w:pStyle w:val="Normal"/>
+        <w:spacing w:lineRule="auto" w:line="240" w:before="0" w:after="0"/>
+        <w:rPr>
+          <w:rFonts w:ascii="Century Gothic" w:hAnsi="Century Gothic" w:eastAsia="Times New Roman" w:cs="Arial"/>
+          <w:sz w:val="18"/>
+          <w:szCs w:val="18"/>
+        </w:rPr>
+      </w:pPr>
+      <w:r>
+        <w:rPr>
+          <w:rFonts w:eastAsia="Times New Roman" w:cs="Arial" w:ascii="Century Gothic" w:hAnsi="Century Gothic"/>
+          <w:sz w:val="18"/>
+          <w:szCs w:val="18"/>
+        </w:rPr>
+        <w:t xml:space="preserve">Für die unten aufgeführten und in Auftrag gegebenen Lieferungen und Leistungen erlauben wir uns, </w:t>
+      </w:r>
+    </w:p>
+    <w:p>
+      <w:pPr>
+        <w:pStyle w:val="Normal"/>
+        <w:spacing w:lineRule="auto" w:line="240" w:before="0" w:after="0"/>
+        <w:rPr>
+          <w:rFonts w:ascii="Century Gothic" w:hAnsi="Century Gothic" w:eastAsia="Times New Roman" w:cs="Arial"/>
+          <w:bCs/>
+          <w:sz w:val="18"/>
+          <w:szCs w:val="18"/>
+          <w:lang w:val="de-CH" w:eastAsia="en-US"/>
+        </w:rPr>
+      </w:pPr>
+      <w:r>
+        <w:rPr>
+          <w:rFonts w:eastAsia="Times New Roman" w:cs="Arial" w:ascii="Century Gothic" w:hAnsi="Century Gothic"/>
+          <w:sz w:val="18"/>
+          <w:szCs w:val="18"/>
+        </w:rPr>
+        <w:t>Ihnen folgendes zu berechnen:</w:t>
+      </w:r>
+      <w:r>
+        <w:rPr>
+          <w:rFonts w:eastAsia="Times New Roman" w:cs="Arial" w:ascii="Century Gothic" w:hAnsi="Century Gothic"/>
+          <w:sz w:val="16"/>
+          <w:szCs w:val="16"/>
+        </w:rPr>
+        <w:t xml:space="preserve"> </w:t>
+      </w:r>
+      <w:r>
+        <w:rPr>
+          <w:rFonts w:eastAsia="Times New Roman" w:cs="Arial" w:ascii="Century Gothic" w:hAnsi="Century Gothic"/>
+          <w:bCs/>
+          <w:sz w:val="18"/>
+          <w:szCs w:val="18"/>
+          <w:lang w:val="de-CH" w:eastAsia="en-US"/>
+        </w:rPr>
+        <w:t>Dienstleistungen von Herrn Kunkel gemäß vorliegenden Dienstleistungsnachweisen</w:t>
+      </w:r>
+    </w:p>
+    <w:p>
+      <w:pPr>
+        <w:pStyle w:val="Normal"/>
+        <w:spacing w:lineRule="auto" w:line="240" w:before="0" w:after="0"/>
+        <w:rPr>
+          <w:rFonts w:ascii="Century Gothic" w:hAnsi="Century Gothic" w:eastAsia="Times New Roman" w:cs="Arial"/>
+          <w:sz w:val="16"/>
+          <w:szCs w:val="16"/>
+        </w:rPr>
+      </w:pPr>
+      <w:r>
+        <w:rPr>
+          <w:rFonts w:eastAsia="Times New Roman" w:cs="Arial" w:ascii="Century Gothic" w:hAnsi="Century Gothic"/>
+          <w:sz w:val="16"/>
+          <w:szCs w:val="16"/>
+        </w:rPr>
+      </w:r>
+    </w:p>
+    <w:p>
+      <w:pPr>
+        <w:pStyle w:val="Normal"/>
+        <w:spacing w:lineRule="auto" w:line="240" w:before="0" w:after="0"/>
+        <w:rPr>
+          <w:rFonts w:ascii="Century Gothic" w:hAnsi="Century Gothic" w:eastAsia="Times New Roman" w:cs="Arial"/>
+          <w:sz w:val="18"/>
+          <w:szCs w:val="18"/>
+        </w:rPr>
+      </w:pPr>
+      <w:r>
+        <w:rPr>
+          <w:rFonts w:eastAsia="Times New Roman" w:cs="Arial" w:ascii="Century Gothic" w:hAnsi="Century Gothic"/>
+          <w:sz w:val="18"/>
+          <w:szCs w:val="18"/>
+        </w:rPr>
+      </w:r>
+    </w:p>
+    <w:tbl>
+      <w:tblPr>
+        <w:tblW w:w="9465" w:type="dxa"/>
+        <w:jc w:val="start"/>
+        <w:tblInd w:w="0" w:type="dxa"/>
+        <w:tblLayout w:type="fixed"/>
+        <w:tblCellMar>
+          <w:top w:w="0" w:type="dxa"/>
+          <w:start w:w="108" w:type="dxa"/>
+          <w:bottom w:w="0" w:type="dxa"/>
+          <w:end w:w="108" w:type="dxa"/>
+        </w:tblCellMar>
+        <w:tblLook w:val="01e0" w:noVBand="0" w:noHBand="0" w:lastColumn="1" w:firstColumn="1" w:lastRow="1" w:firstRow="1"/>
+      </w:tblPr>
+      <w:tblGrid>
+        <w:gridCol w:w="562"/>
+        <w:gridCol w:w="709"/>
+        <w:gridCol w:w="709"/>
+        <w:gridCol w:w="5386"/>
+        <w:gridCol w:w="994"/>
+        <w:gridCol w:w="1105"/>
+      </w:tblGrid>
+      <w:tr>
+        <w:trPr/>
+        <w:tc>
+          <w:tcPr>
+            <w:tcW w:w="562" w:type="dxa"/>
+            <w:tcBorders>
+              <w:top w:val="single" w:sz="4" w:space="0" w:color="000000"/>
+              <w:start w:val="single" w:sz="4" w:space="0" w:color="000000"/>
+              <w:bottom w:val="single" w:sz="4" w:space="0" w:color="000000"/>
+              <w:end w:val="single" w:sz="4" w:space="0" w:color="000000"/>
+            </w:tcBorders>
+          </w:tcPr>
+          <w:p>
+            <w:pPr>
+              <w:pStyle w:val="Normal"/>
+              <w:spacing w:lineRule="auto" w:line="240" w:before="0" w:after="0"/>
+              <w:rPr>
+                <w:rFonts w:ascii="Century Gothic" w:hAnsi="Century Gothic" w:eastAsia="Times New Roman" w:cs="Arial"/>
+                <w:b/>
+                <w:sz w:val="18"/>
+                <w:szCs w:val="18"/>
+                <w:lang w:val="de-CH" w:eastAsia="en-US"/>
+              </w:rPr>
+            </w:pPr>
+            <w:r>
+              <w:rPr>
+                <w:rFonts w:eastAsia="Times New Roman" w:cs="Arial" w:ascii="Century Gothic" w:hAnsi="Century Gothic"/>
+                <w:b/>
+                <w:sz w:val="18"/>
+                <w:szCs w:val="18"/>
+                <w:lang w:val="de-CH" w:eastAsia="en-US"/>
+              </w:rPr>
+              <w:t>Pos</w:t>
+            </w:r>
+          </w:p>
+        </w:tc>
+        <w:tc>
+          <w:tcPr>
+            <w:tcW w:w="709" w:type="dxa"/>
+            <w:tcBorders>
+              <w:top w:val="single" w:sz="4" w:space="0" w:color="000000"/>
+              <w:start w:val="single" w:sz="4" w:space="0" w:color="000000"/>
+              <w:bottom w:val="single" w:sz="4" w:space="0" w:color="000000"/>
+              <w:end w:val="single" w:sz="4" w:space="0" w:color="000000"/>
+            </w:tcBorders>
+          </w:tcPr>
+          <w:p>
+            <w:pPr>
+              <w:pStyle w:val="Normal"/>
+              <w:spacing w:lineRule="auto" w:line="240" w:before="0" w:after="0"/>
+              <w:rPr>
+                <w:rFonts w:ascii="Century Gothic" w:hAnsi="Century Gothic" w:eastAsia="Times New Roman" w:cs="Arial"/>
+                <w:b/>
+                <w:sz w:val="18"/>
+                <w:szCs w:val="18"/>
+                <w:lang w:val="de-CH" w:eastAsia="en-US"/>
+              </w:rPr>
+            </w:pPr>
+            <w:r>
+              <w:rPr>
+                <w:rFonts w:eastAsia="Times New Roman" w:cs="Arial" w:ascii="Century Gothic" w:hAnsi="Century Gothic"/>
+                <w:b/>
+                <w:sz w:val="18"/>
+                <w:szCs w:val="18"/>
+                <w:lang w:val="de-CH" w:eastAsia="en-US"/>
+              </w:rPr>
+              <w:t>Anz.</w:t>
+            </w:r>
+          </w:p>
+        </w:tc>
+        <w:tc>
+          <w:tcPr>
+            <w:tcW w:w="709" w:type="dxa"/>
+            <w:tcBorders>
+              <w:top w:val="single" w:sz="4" w:space="0" w:color="000000"/>
+              <w:start w:val="single" w:sz="4" w:space="0" w:color="000000"/>
+              <w:bottom w:val="single" w:sz="4" w:space="0" w:color="000000"/>
+              <w:end w:val="single" w:sz="4" w:space="0" w:color="000000"/>
+            </w:tcBorders>
+          </w:tcPr>
+          <w:p>
+            <w:pPr>
+              <w:pStyle w:val="Normal"/>
+              <w:spacing w:lineRule="auto" w:line="240" w:before="0" w:after="0"/>
+              <w:rPr>
+                <w:rFonts w:ascii="Century Gothic" w:hAnsi="Century Gothic" w:eastAsia="Times New Roman" w:cs="Arial"/>
+                <w:b/>
+                <w:sz w:val="18"/>
+                <w:szCs w:val="18"/>
+                <w:lang w:val="de-CH" w:eastAsia="en-US"/>
+              </w:rPr>
+            </w:pPr>
+            <w:r>
+              <w:rPr>
+                <w:rFonts w:eastAsia="Times New Roman" w:cs="Arial" w:ascii="Century Gothic" w:hAnsi="Century Gothic"/>
+                <w:b/>
+                <w:sz w:val="18"/>
+                <w:szCs w:val="18"/>
+                <w:lang w:val="de-CH" w:eastAsia="en-US"/>
+              </w:rPr>
+              <w:t>LE</w:t>
+            </w:r>
+          </w:p>
+          <w:p>
+            <w:pPr>
+              <w:pStyle w:val="Normal"/>
+              <w:spacing w:lineRule="auto" w:line="240" w:before="0" w:after="0"/>
+              <w:rPr>
+                <w:rFonts w:ascii="Century Gothic" w:hAnsi="Century Gothic" w:eastAsia="Times New Roman" w:cs="Arial"/>
+                <w:b/>
+                <w:sz w:val="18"/>
+                <w:szCs w:val="18"/>
+                <w:lang w:val="de-CH" w:eastAsia="en-US"/>
+              </w:rPr>
+            </w:pPr>
+            <w:r>
+              <w:rPr>
+                <w:rFonts w:eastAsia="Times New Roman" w:cs="Arial" w:ascii="Century Gothic" w:hAnsi="Century Gothic"/>
+                <w:b/>
+                <w:sz w:val="18"/>
+                <w:szCs w:val="18"/>
+                <w:lang w:val="de-CH" w:eastAsia="en-US"/>
+              </w:rPr>
+              <w:t>Std.</w:t>
+            </w:r>
+          </w:p>
+        </w:tc>
+        <w:tc>
+          <w:tcPr>
+            <w:tcW w:w="5386" w:type="dxa"/>
+            <w:tcBorders>
+              <w:top w:val="single" w:sz="4" w:space="0" w:color="000000"/>
+              <w:start w:val="single" w:sz="4" w:space="0" w:color="000000"/>
+              <w:bottom w:val="single" w:sz="4" w:space="0" w:color="000000"/>
+              <w:end w:val="single" w:sz="4" w:space="0" w:color="000000"/>
+            </w:tcBorders>
+          </w:tcPr>
+          <w:p>
+            <w:pPr>
+              <w:pStyle w:val="Normal"/>
+              <w:tabs>
+                <w:tab w:val="clear" w:pos="708"/>
+                <w:tab w:val="left" w:pos="1428" w:leader="none"/>
+                <w:tab w:val="left" w:pos="1572" w:leader="none"/>
+                <w:tab w:val="left" w:pos="1691" w:leader="none"/>
+              </w:tabs>
+              <w:spacing w:lineRule="auto" w:line="240" w:before="0" w:after="0"/>
+              <w:rPr>
+                <w:rFonts w:ascii="Century Gothic" w:hAnsi="Century Gothic" w:eastAsia="Times New Roman" w:cs="Arial"/>
+                <w:b/>
+                <w:sz w:val="18"/>
+                <w:szCs w:val="18"/>
+                <w:lang w:val="de-CH" w:eastAsia="en-US"/>
+              </w:rPr>
+            </w:pPr>
+            <w:r>
+              <w:rPr>
+                <w:rFonts w:eastAsia="Times New Roman" w:cs="Arial" w:ascii="Century Gothic" w:hAnsi="Century Gothic"/>
+                <w:b/>
+                <w:sz w:val="18"/>
+                <w:szCs w:val="18"/>
+                <w:lang w:val="de-CH" w:eastAsia="en-US"/>
+              </w:rPr>
+              <w:t>Spezifikation</w:t>
+              <w:tab/>
+              <w:tab/>
+              <w:tab/>
+            </w:r>
+          </w:p>
+        </w:tc>
+        <w:tc>
+          <w:tcPr>
+            <w:tcW w:w="994" w:type="dxa"/>
+            <w:tcBorders>
+              <w:top w:val="single" w:sz="4" w:space="0" w:color="000000"/>
+              <w:start w:val="single" w:sz="4" w:space="0" w:color="000000"/>
+              <w:bottom w:val="single" w:sz="4" w:space="0" w:color="000000"/>
+              <w:end w:val="single" w:sz="4" w:space="0" w:color="000000"/>
+            </w:tcBorders>
+          </w:tcPr>
+          <w:p>
+            <w:pPr>
+              <w:pStyle w:val="Normal"/>
+              <w:spacing w:lineRule="auto" w:line="240" w:before="0" w:after="0"/>
+              <w:rPr>
+                <w:rFonts w:ascii="Century Gothic" w:hAnsi="Century Gothic" w:eastAsia="Times New Roman" w:cs="Arial"/>
+                <w:b/>
+                <w:sz w:val="18"/>
+                <w:szCs w:val="18"/>
+                <w:lang w:val="de-CH" w:eastAsia="en-US"/>
+              </w:rPr>
+            </w:pPr>
+            <w:r>
+              <w:rPr>
+                <w:rFonts w:eastAsia="Times New Roman" w:cs="Arial" w:ascii="Century Gothic" w:hAnsi="Century Gothic"/>
+                <w:b/>
+                <w:sz w:val="18"/>
+                <w:szCs w:val="18"/>
+                <w:lang w:val="de-CH" w:eastAsia="en-US"/>
+              </w:rPr>
+              <w:t>EP €</w:t>
+            </w:r>
+          </w:p>
+        </w:tc>
+        <w:tc>
+          <w:tcPr>
+            <w:tcW w:w="1105" w:type="dxa"/>
+            <w:tcBorders>
+              <w:top w:val="single" w:sz="4" w:space="0" w:color="000000"/>
+              <w:start w:val="single" w:sz="4" w:space="0" w:color="000000"/>
+              <w:bottom w:val="single" w:sz="4" w:space="0" w:color="000000"/>
+              <w:end w:val="single" w:sz="4" w:space="0" w:color="000000"/>
+            </w:tcBorders>
+          </w:tcPr>
+          <w:p>
+            <w:pPr>
+              <w:pStyle w:val="Normal"/>
+              <w:spacing w:lineRule="auto" w:line="240" w:before="0" w:after="0"/>
+              <w:rPr>
+                <w:rFonts w:ascii="Century Gothic" w:hAnsi="Century Gothic" w:eastAsia="Times New Roman" w:cs="Arial"/>
+                <w:b/>
+                <w:sz w:val="18"/>
+                <w:szCs w:val="18"/>
+                <w:lang w:val="de-CH" w:eastAsia="en-US"/>
+              </w:rPr>
+            </w:pPr>
+            <w:r>
+              <w:rPr>
+                <w:rFonts w:eastAsia="Times New Roman" w:cs="Arial" w:ascii="Century Gothic" w:hAnsi="Century Gothic"/>
+                <w:b/>
+                <w:sz w:val="18"/>
+                <w:szCs w:val="18"/>
+                <w:lang w:val="de-CH" w:eastAsia="en-US"/>
+              </w:rPr>
+              <w:t>GP € nt.</w:t>
+            </w:r>
+          </w:p>
+        </w:tc>
+      </w:tr>
+      <w:tr>
+        <w:trPr/>
+        <w:tc>
+          <w:tcPr>
+            <w:tcW w:w="562" w:type="dxa"/>
+            <w:tcBorders>
+              <w:top w:val="single" w:sz="4" w:space="0" w:color="000000"/>
+              <w:start w:val="single" w:sz="4" w:space="0" w:color="000000"/>
+              <w:bottom w:val="single" w:sz="4" w:space="0" w:color="000000"/>
+              <w:end w:val="single" w:sz="4" w:space="0" w:color="000000"/>
+            </w:tcBorders>
+          </w:tcPr>
+          <w:p>
+            <w:pPr>
+              <w:pStyle w:val="Normal"/>
+              <w:spacing w:lineRule="auto" w:line="240" w:before="0" w:after="0"/>
+              <w:rPr>
+                <w:rFonts w:ascii="Century Gothic" w:hAnsi="Century Gothic" w:eastAsia="Times New Roman" w:cs="Arial"/>
+                <w:sz w:val="18"/>
+                <w:szCs w:val="18"/>
+                <w:lang w:val="de-CH" w:eastAsia="en-US"/>
+              </w:rPr>
+            </w:pPr>
+            <w:r>
+              <w:rPr>
+                <w:rFonts w:eastAsia="Times New Roman" w:cs="Arial" w:ascii="Century Gothic" w:hAnsi="Century Gothic"/>
+                <w:sz w:val="18"/>
+                <w:szCs w:val="18"/>
+                <w:lang w:val="de-CH" w:eastAsia="en-US"/>
+              </w:rPr>
+              <w:t>{#positions}{pos}</w:t>
+            </w:r>
+          </w:p>
+        </w:tc>
+        <w:tc>
+          <w:tcPr>
+            <w:tcW w:w="709" w:type="dxa"/>
+            <w:tcBorders>
+              <w:top w:val="single" w:sz="4" w:space="0" w:color="000000"/>
+              <w:start w:val="single" w:sz="4" w:space="0" w:color="000000"/>
+              <w:bottom w:val="single" w:sz="4" w:space="0" w:color="000000"/>
+              <w:end w:val="single" w:sz="4" w:space="0" w:color="000000"/>
+            </w:tcBorders>
+          </w:tcPr>
+          <w:p>
+            <w:pPr>
+              <w:pStyle w:val="Normal"/>
+              <w:spacing w:lineRule="auto" w:line="240" w:before="0" w:after="0"/>
+              <w:jc w:val="center"/>
+              <w:rPr>
+                <w:rFonts w:ascii="Century Gothic" w:hAnsi="Century Gothic" w:eastAsia="Times New Roman" w:cs="Arial"/>
+                <w:sz w:val="18"/>
+                <w:szCs w:val="18"/>
+                <w:lang w:val="de-CH" w:eastAsia="en-US"/>
+              </w:rPr>
+            </w:pPr>
+            <w:r>
+              <w:rPr>
+                <w:rFonts w:eastAsia="Times New Roman" w:cs="Arial" w:ascii="Century Gothic" w:hAnsi="Century Gothic"/>
+                <w:sz w:val="18"/>
+                <w:szCs w:val="18"/>
+                <w:lang w:val="de-CH" w:eastAsia="en-US"/>
+              </w:rPr>
+              <w:t>{hours}</w:t>
+            </w:r>
+          </w:p>
+        </w:tc>
+        <w:tc>
+          <w:tcPr>
+            <w:tcW w:w="709" w:type="dxa"/>
+            <w:tcBorders>
+              <w:top w:val="single" w:sz="4" w:space="0" w:color="000000"/>
+              <w:start w:val="single" w:sz="4" w:space="0" w:color="000000"/>
+              <w:bottom w:val="single" w:sz="4" w:space="0" w:color="000000"/>
+              <w:end w:val="single" w:sz="4" w:space="0" w:color="000000"/>
+            </w:tcBorders>
+          </w:tcPr>
+          <w:p>
+            <w:pPr>
+              <w:pStyle w:val="Normal"/>
+              <w:spacing w:lineRule="auto" w:line="240" w:before="0" w:after="0"/>
+              <w:rPr>
+                <w:rFonts w:ascii="Century Gothic" w:hAnsi="Century Gothic" w:eastAsia="Times New Roman" w:cs="Arial"/>
+                <w:sz w:val="18"/>
+                <w:szCs w:val="18"/>
+                <w:lang w:val="de-CH" w:eastAsia="en-US"/>
+              </w:rPr>
+            </w:pPr>
+            <w:r>
+              <w:rPr>
+                <w:rFonts w:eastAsia="Times New Roman" w:cs="Arial" w:ascii="Century Gothic" w:hAnsi="Century Gothic"/>
+                <w:sz w:val="18"/>
+                <w:szCs w:val="18"/>
+                <w:lang w:val="de-CH" w:eastAsia="en-US"/>
+              </w:rPr>
+              <w:t>{le}</w:t>
+            </w:r>
+          </w:p>
+        </w:tc>
+        <w:tc>
+          <w:tcPr>
+            <w:tcW w:w="5386" w:type="dxa"/>
+            <w:tcBorders>
+              <w:top w:val="single" w:sz="4" w:space="0" w:color="000000"/>
+              <w:start w:val="single" w:sz="4" w:space="0" w:color="000000"/>
+              <w:bottom w:val="single" w:sz="4" w:space="0" w:color="000000"/>
+              <w:end w:val="single" w:sz="4" w:space="0" w:color="000000"/>
+            </w:tcBorders>
+          </w:tcPr>
+          <w:p>
+            <w:pPr>
+              <w:pStyle w:val="Normal"/>
+              <w:spacing w:lineRule="auto" w:line="240" w:before="0" w:after="0"/>
+              <w:rPr>
+                <w:rFonts w:ascii="Century Gothic" w:hAnsi="Century Gothic" w:eastAsia="Times New Roman" w:cs="Arial"/>
+                <w:sz w:val="18"/>
+                <w:szCs w:val="18"/>
+              </w:rPr>
+            </w:pPr>
+            <w:r>
+              <w:rPr>
+                <w:rFonts w:eastAsia="Times New Roman" w:cs="Arial" w:ascii="Century Gothic" w:hAnsi="Century Gothic"/>
+                <w:b/>
+                <w:sz w:val="18"/>
+                <w:szCs w:val="18"/>
+              </w:rPr>
+              <w:t>{spec}</w:t>
+            </w:r>
+          </w:p>
+        </w:tc>
+        <w:tc>
+          <w:tcPr>
+            <w:tcW w:w="994" w:type="dxa"/>
+            <w:tcBorders>
+              <w:top w:val="single" w:sz="4" w:space="0" w:color="000000"/>
+              <w:start w:val="single" w:sz="4" w:space="0" w:color="000000"/>
+              <w:bottom w:val="single" w:sz="4" w:space="0" w:color="000000"/>
+              <w:end w:val="single" w:sz="4" w:space="0" w:color="000000"/>
+            </w:tcBorders>
+          </w:tcPr>
+          <w:p>
+            <w:pPr>
+              <w:pStyle w:val="Normal"/>
+              <w:tabs>
+                <w:tab w:val="clear" w:pos="708"/>
+                <w:tab w:val="decimal" w:pos="7088" w:leader="none"/>
+              </w:tabs>
+              <w:spacing w:lineRule="auto" w:line="240" w:before="0" w:after="0"/>
+              <w:jc w:val="center"/>
+              <w:rPr>
+                <w:rFonts w:ascii="Century Gothic" w:hAnsi="Century Gothic" w:eastAsia="Arial Unicode MS" w:cs="Arial"/>
+                <w:sz w:val="18"/>
+                <w:szCs w:val="18"/>
+                <w:lang w:val="de-CH" w:eastAsia="en-US"/>
+              </w:rPr>
+            </w:pPr>
+            <w:r>
+              <w:rPr>
+                <w:rFonts w:eastAsia="Arial Unicode MS" w:cs="Arial" w:ascii="Century Gothic" w:hAnsi="Century Gothic"/>
+                <w:sz w:val="18"/>
+                <w:szCs w:val="18"/>
+                <w:lang w:val="de-CH" w:eastAsia="en-US"/>
+              </w:rPr>
+              <w:t>{ep}</w:t>
+            </w:r>
+          </w:p>
+        </w:tc>
+        <w:tc>
+          <w:tcPr>
+            <w:tcW w:w="1105" w:type="dxa"/>
+            <w:tcBorders>
+              <w:top w:val="single" w:sz="4" w:space="0" w:color="000000"/>
+              <w:start w:val="single" w:sz="4" w:space="0" w:color="000000"/>
+              <w:bottom w:val="single" w:sz="4" w:space="0" w:color="000000"/>
+              <w:end w:val="single" w:sz="4" w:space="0" w:color="000000"/>
+            </w:tcBorders>
+          </w:tcPr>
+          <w:p>
+            <w:pPr>
+              <w:pStyle w:val="Normal"/>
+              <w:tabs>
+                <w:tab w:val="clear" w:pos="708"/>
+                <w:tab w:val="decimal" w:pos="8222" w:leader="none"/>
+              </w:tabs>
+              <w:spacing w:lineRule="auto" w:line="240" w:before="0" w:after="0"/>
+              <w:jc w:val="center"/>
+              <w:rPr>
+                <w:rFonts w:ascii="Century Gothic" w:hAnsi="Century Gothic" w:eastAsia="Arial Unicode MS" w:cs="Arial"/>
+                <w:sz w:val="18"/>
+                <w:szCs w:val="18"/>
+                <w:lang w:val="de-CH" w:eastAsia="en-US"/>
+              </w:rPr>
+            </w:pPr>
+            <w:r>
+              <w:rPr>
+                <w:rFonts w:eastAsia="Arial Unicode MS" w:cs="Arial" w:ascii="Century Gothic" w:hAnsi="Century Gothic"/>
+                <w:sz w:val="18"/>
+                <w:szCs w:val="18"/>
+                <w:lang w:val="de-CH" w:eastAsia="en-US"/>
+              </w:rPr>
+              <w:t>{gp}{/positions}</w:t>
+            </w:r>
+          </w:p>
+        </w:tc>
+      </w:tr>
+      <w:tr>
+        <w:trPr/>
+        <w:tc>
+          <w:tcPr>
+            <w:tcW w:w="8360" w:type="dxa"/>
+            <w:gridSpan w:val="5"/>
+            <w:tcBorders>
+              <w:top w:val="single" w:sz="4" w:space="0" w:color="000000"/>
+              <w:start w:val="single" w:sz="4" w:space="0" w:color="000000"/>
+              <w:bottom w:val="single" w:sz="4" w:space="0" w:color="000000"/>
+              <w:end w:val="single" w:sz="4" w:space="0" w:color="000000"/>
+            </w:tcBorders>
+          </w:tcPr>
+          <w:p>
+            <w:pPr>
+              <w:pStyle w:val="Normal"/>
+              <w:spacing w:lineRule="auto" w:line="240" w:before="0" w:after="0"/>
+              <w:rPr>
+                <w:rFonts w:ascii="Century Gothic" w:hAnsi="Century Gothic" w:eastAsia="Times New Roman" w:cs="Arial"/>
+                <w:b/>
+                <w:sz w:val="18"/>
+                <w:szCs w:val="18"/>
+                <w:lang w:val="de-CH" w:eastAsia="en-US"/>
+              </w:rPr>
+            </w:pPr>
+            <w:r>
+              <w:rPr>
+                <w:rFonts w:eastAsia="Times New Roman" w:cs="Arial" w:ascii="Century Gothic" w:hAnsi="Century Gothic"/>
+                <w:b/>
+                <w:sz w:val="18"/>
+                <w:szCs w:val="18"/>
+                <w:lang w:val="de-CH" w:eastAsia="en-US"/>
+              </w:rPr>
+              <w:t>Zwischensumme netto in EURO</w:t>
+            </w:r>
+          </w:p>
+        </w:tc>
+        <w:tc>
+          <w:tcPr>
+            <w:tcW w:w="1105" w:type="dxa"/>
+            <w:tcBorders>
+              <w:top w:val="single" w:sz="4" w:space="0" w:color="000000"/>
+              <w:start w:val="single" w:sz="4" w:space="0" w:color="000000"/>
+              <w:bottom w:val="single" w:sz="4" w:space="0" w:color="000000"/>
+              <w:end w:val="single" w:sz="4" w:space="0" w:color="000000"/>
+            </w:tcBorders>
+          </w:tcPr>
+          <w:p>
+            <w:pPr>
+              <w:pStyle w:val="Normal"/>
+              <w:tabs>
+                <w:tab w:val="clear" w:pos="708"/>
+                <w:tab w:val="decimal" w:pos="8222" w:leader="none"/>
+              </w:tabs>
+              <w:spacing w:lineRule="auto" w:line="240" w:before="0" w:after="0"/>
+              <w:rPr>
+                <w:rFonts w:ascii="Century Gothic" w:hAnsi="Century Gothic" w:eastAsia="Times New Roman" w:cs="Arial"/>
+                <w:b/>
+                <w:sz w:val="18"/>
+                <w:szCs w:val="18"/>
+                <w:lang w:val="de-CH" w:eastAsia="en-US"/>
+              </w:rPr>
+            </w:pPr>
+            <w:r>
+              <w:rPr>
+                <w:rFonts w:eastAsia="Times New Roman" w:cs="Arial" w:ascii="Century Gothic" w:hAnsi="Century Gothic"/>
+                <w:b/>
+                <w:sz w:val="18"/>
+                <w:szCs w:val="18"/>
+                <w:lang w:val="de-CH" w:eastAsia="en-US"/>
+              </w:rPr>
+              <w:t>{netTotal}</w:t>
+            </w:r>
+          </w:p>
+        </w:tc>
+      </w:tr>
+      <w:tr>
+        <w:trPr/>
+        <w:tc>
+          <w:tcPr>
+            <w:tcW w:w="8360" w:type="dxa"/>
+            <w:gridSpan w:val="5"/>
+            <w:tcBorders>
+              <w:top w:val="single" w:sz="4" w:space="0" w:color="000000"/>
+              <w:start w:val="single" w:sz="4" w:space="0" w:color="000000"/>
+              <w:bottom w:val="single" w:sz="4" w:space="0" w:color="000000"/>
+              <w:end w:val="single" w:sz="4" w:space="0" w:color="000000"/>
+            </w:tcBorders>
+          </w:tcPr>
+          <w:p>
+            <w:pPr>
+              <w:pStyle w:val="Normal"/>
+              <w:spacing w:lineRule="auto" w:line="240" w:before="0" w:after="0"/>
+              <w:rPr>
+                <w:rFonts w:ascii="Century Gothic" w:hAnsi="Century Gothic" w:eastAsia="Times New Roman" w:cs="Arial"/>
+                <w:b/>
+                <w:sz w:val="18"/>
+                <w:szCs w:val="18"/>
+                <w:lang w:val="de-CH" w:eastAsia="en-US"/>
+              </w:rPr>
+            </w:pPr>
+            <w:r>
+              <w:rPr>
+                <w:rFonts w:eastAsia="Times New Roman" w:cs="Arial" w:ascii="Century Gothic" w:hAnsi="Century Gothic"/>
+                <w:b/>
+                <w:sz w:val="18"/>
+                <w:szCs w:val="18"/>
+                <w:lang w:val="de-CH" w:eastAsia="en-US"/>
+              </w:rPr>
+              <w:t>Zzgl. 19% Umsatzsteuer</w:t>
+            </w:r>
+          </w:p>
+        </w:tc>
+        <w:tc>
+          <w:tcPr>
+            <w:tcW w:w="1105" w:type="dxa"/>
+            <w:tcBorders>
+              <w:top w:val="single" w:sz="4" w:space="0" w:color="000000"/>
+              <w:start w:val="single" w:sz="4" w:space="0" w:color="000000"/>
+              <w:bottom w:val="single" w:sz="4" w:space="0" w:color="000000"/>
+              <w:end w:val="single" w:sz="4" w:space="0" w:color="000000"/>
+            </w:tcBorders>
+          </w:tcPr>
+          <w:p>
+            <w:pPr>
+              <w:pStyle w:val="Normal"/>
+              <w:tabs>
+                <w:tab w:val="clear" w:pos="708"/>
+                <w:tab w:val="decimal" w:pos="8222" w:leader="none"/>
+              </w:tabs>
+              <w:spacing w:lineRule="auto" w:line="240" w:before="0" w:after="0"/>
+              <w:rPr>
+                <w:rFonts w:ascii="Century Gothic" w:hAnsi="Century Gothic" w:eastAsia="Times New Roman" w:cs="Arial"/>
+                <w:b/>
+                <w:sz w:val="18"/>
+                <w:szCs w:val="18"/>
+                <w:lang w:val="de-CH" w:eastAsia="en-US"/>
+              </w:rPr>
+            </w:pPr>
+            <w:r>
+              <w:rPr>
+                <w:rFonts w:eastAsia="Times New Roman" w:cs="Arial" w:ascii="Century Gothic" w:hAnsi="Century Gothic"/>
+                <w:b/>
+                <w:sz w:val="18"/>
+                <w:szCs w:val="18"/>
+                <w:lang w:val="de-CH" w:eastAsia="en-US"/>
+              </w:rPr>
+              <w:t>{vatAmount}</w:t>
+            </w:r>
+          </w:p>
+        </w:tc>
+      </w:tr>
+      <w:tr>
+        <w:trPr/>
+        <w:tc>
+          <w:tcPr>
+            <w:tcW w:w="8360" w:type="dxa"/>
+            <w:gridSpan w:val="5"/>
+            <w:tcBorders>
+              <w:top w:val="single" w:sz="4" w:space="0" w:color="000000"/>
+              <w:start w:val="single" w:sz="4" w:space="0" w:color="000000"/>
+              <w:bottom w:val="single" w:sz="4" w:space="0" w:color="000000"/>
+              <w:end w:val="single" w:sz="4" w:space="0" w:color="000000"/>
+            </w:tcBorders>
+          </w:tcPr>
+          <w:p>
+            <w:pPr>
+              <w:pStyle w:val="Normal"/>
+              <w:spacing w:lineRule="auto" w:line="240" w:before="0" w:after="0"/>
+              <w:rPr>
+                <w:rFonts w:ascii="Century Gothic" w:hAnsi="Century Gothic" w:eastAsia="Times New Roman" w:cs="Arial"/>
+                <w:b/>
+                <w:sz w:val="18"/>
+                <w:szCs w:val="18"/>
+                <w:lang w:val="de-CH" w:eastAsia="en-US"/>
+              </w:rPr>
+            </w:pPr>
+            <w:r>
+              <w:rPr>
+                <w:rFonts w:eastAsia="Times New Roman" w:cs="Arial" w:ascii="Century Gothic" w:hAnsi="Century Gothic"/>
+                <w:b/>
+                <w:sz w:val="18"/>
+                <w:szCs w:val="18"/>
+                <w:lang w:val="de-CH" w:eastAsia="en-US"/>
+              </w:rPr>
+              <w:t>Gesamtbetrag brutto in EURO</w:t>
+            </w:r>
+          </w:p>
+        </w:tc>
+        <w:tc>
+          <w:tcPr>
+            <w:tcW w:w="1105" w:type="dxa"/>
+            <w:tcBorders>
+              <w:top w:val="single" w:sz="4" w:space="0" w:color="000000"/>
+              <w:start w:val="single" w:sz="4" w:space="0" w:color="000000"/>
+              <w:bottom w:val="single" w:sz="4" w:space="0" w:color="000000"/>
+              <w:end w:val="single" w:sz="4" w:space="0" w:color="000000"/>
+            </w:tcBorders>
+          </w:tcPr>
+          <w:p>
+            <w:pPr>
+              <w:pStyle w:val="Normal"/>
+              <w:tabs>
+                <w:tab w:val="clear" w:pos="708"/>
+                <w:tab w:val="decimal" w:pos="8222" w:leader="none"/>
+              </w:tabs>
+              <w:spacing w:lineRule="auto" w:line="240" w:before="0" w:after="0"/>
+              <w:rPr>
+                <w:rFonts w:ascii="Century Gothic" w:hAnsi="Century Gothic" w:eastAsia="Times New Roman" w:cs="Arial"/>
+                <w:b/>
+                <w:sz w:val="18"/>
+                <w:szCs w:val="18"/>
+                <w:lang w:val="de-CH" w:eastAsia="en-US"/>
+              </w:rPr>
+            </w:pPr>
+            <w:r>
+              <w:rPr>
+                <w:rFonts w:eastAsia="Times New Roman" w:cs="Arial" w:ascii="Century Gothic" w:hAnsi="Century Gothic"/>
+                <w:b/>
+                <w:sz w:val="18"/>
+                <w:szCs w:val="18"/>
+                <w:lang w:val="de-CH" w:eastAsia="en-US"/>
+              </w:rPr>
+              <w:t>{grossTotal}</w:t>
+            </w:r>
+          </w:p>
+        </w:tc>
+      </w:tr>
+    </w:tbl>
+    <w:p>
+      <w:pPr>
+        <w:pStyle w:val="Normal"/>
+        <w:spacing w:lineRule="auto" w:line="240" w:before="0" w:after="0"/>
+        <w:rPr>
+          <w:rFonts w:ascii="Century Gothic" w:hAnsi="Century Gothic" w:eastAsia="Times New Roman" w:cs="Arial"/>
+          <w:sz w:val="16"/>
+          <w:szCs w:val="16"/>
+        </w:rPr>
+      </w:pPr>
+      <w:r>
+        <w:rPr>
+          <w:rFonts w:eastAsia="Times New Roman" w:cs="Arial" w:ascii="Century Gothic" w:hAnsi="Century Gothic"/>
+          <w:sz w:val="16"/>
+          <w:szCs w:val="16"/>
+        </w:rPr>
+      </w:r>
+    </w:p>
+    <w:p>
+      <w:pPr>
+        <w:pStyle w:val="Normal"/>
+        <w:spacing w:lineRule="auto" w:line="240" w:before="0" w:after="0"/>
+        <w:rPr>
+          <w:rFonts w:ascii="Century Gothic" w:hAnsi="Century Gothic" w:eastAsia="Times New Roman" w:cs="Arial"/>
+          <w:sz w:val="16"/>
+          <w:szCs w:val="16"/>
+        </w:rPr>
+      </w:pPr>
+      <w:r>
+        <w:rPr>
+          <w:rFonts w:eastAsia="Times New Roman" w:cs="Arial" w:ascii="Century Gothic" w:hAnsi="Century Gothic"/>
+          <w:sz w:val="16"/>
+          <w:szCs w:val="16"/>
+        </w:rPr>
+      </w:r>
+    </w:p>
+    <w:p>
+      <w:pPr>
+        <w:pStyle w:val="Normal"/>
+        <w:spacing w:lineRule="auto" w:line="240" w:before="0" w:after="0"/>
+        <w:rPr>
+          <w:rFonts w:ascii="Century Gothic" w:hAnsi="Century Gothic" w:eastAsia="Times New Roman" w:cs="Arial"/>
+          <w:sz w:val="16"/>
+          <w:szCs w:val="16"/>
+        </w:rPr>
+      </w:pPr>
+      <w:r>
+        <w:rPr>
+          <w:rFonts w:eastAsia="Times New Roman" w:cs="Arial" w:ascii="Century Gothic" w:hAnsi="Century Gothic"/>
+          <w:sz w:val="16"/>
+          <w:szCs w:val="16"/>
+        </w:rPr>
+      </w:r>
+    </w:p>
+    <w:p>
+      <w:pPr>
+        <w:pStyle w:val="Normal"/>
+        <w:spacing w:lineRule="auto" w:line="240" w:before="0" w:after="0"/>
+        <w:rPr>
+          <w:rFonts w:ascii="Century Gothic" w:hAnsi="Century Gothic" w:eastAsia="Times New Roman" w:cs="Arial"/>
+          <w:sz w:val="16"/>
+          <w:szCs w:val="16"/>
+        </w:rPr>
+      </w:pPr>
+      <w:r>
+        <w:rPr>
+          <w:rFonts w:eastAsia="Times New Roman" w:cs="Arial" w:ascii="Century Gothic" w:hAnsi="Century Gothic"/>
+          <w:sz w:val="16"/>
+          <w:szCs w:val="16"/>
+        </w:rPr>
+      </w:r>
+    </w:p>
+    <w:p>
+      <w:pPr>
+        <w:pStyle w:val="Normal"/>
+        <w:spacing w:lineRule="auto" w:line="240" w:before="0" w:after="0"/>
+        <w:rPr>
+          <w:rFonts w:ascii="Century Gothic" w:hAnsi="Century Gothic" w:eastAsia="Times New Roman" w:cs="Arial"/>
+          <w:sz w:val="16"/>
+          <w:szCs w:val="16"/>
+        </w:rPr>
+      </w:pPr>
+      <w:r>
+        <w:rPr>
+          <w:rFonts w:eastAsia="Times New Roman" w:cs="Arial" w:ascii="Century Gothic" w:hAnsi="Century Gothic"/>
+          <w:sz w:val="16"/>
+          <w:szCs w:val="16"/>
+        </w:rPr>
+      </w:r>
+    </w:p>
+    <w:p>
+      <w:pPr>
+        <w:pStyle w:val="Normal"/>
+        <w:spacing w:lineRule="auto" w:line="240" w:before="0" w:after="0"/>
+        <w:rPr>
+          <w:rFonts w:ascii="Century Gothic" w:hAnsi="Century Gothic" w:eastAsia="Times New Roman" w:cs="Arial"/>
+          <w:sz w:val="16"/>
+          <w:szCs w:val="16"/>
+        </w:rPr>
+      </w:pPr>
+      <w:r>
+        <w:rPr>
+          <w:rFonts w:eastAsia="Times New Roman" w:cs="Arial" w:ascii="Century Gothic" w:hAnsi="Century Gothic"/>
+          <w:sz w:val="16"/>
+          <w:szCs w:val="16"/>
+        </w:rPr>
+      </w:r>
+    </w:p>
+    <w:p>
+      <w:pPr>
+        <w:pStyle w:val="Normal"/>
+        <w:spacing w:lineRule="auto" w:line="240" w:before="0" w:after="0"/>
+        <w:rPr>
+          <w:rFonts w:ascii="Century Gothic" w:hAnsi="Century Gothic" w:eastAsia="Times New Roman" w:cs="Arial"/>
+          <w:b/>
+          <w:sz w:val="20"/>
+          <w:szCs w:val="20"/>
+        </w:rPr>
+      </w:pPr>
+      <w:r>
+        <w:rPr>
+          <w:rFonts w:eastAsia="Times New Roman" w:cs="Arial" w:ascii="Century Gothic" w:hAnsi="Century Gothic"/>
+          <w:b/>
+          <w:sz w:val="20"/>
+          <w:szCs w:val="20"/>
+        </w:rPr>
+        <w:t>Zahlbar bis zum {payUntil} ohne Abzug. Vielen Dank für Ihren Auftrag!</w:t>
+      </w:r>
+    </w:p>
+    <w:p>
+      <w:pPr>
+        <w:pStyle w:val="Normal"/>
+        <w:spacing w:lineRule="auto" w:line="240" w:before="0" w:after="0"/>
+        <w:rPr>
+          <w:rFonts w:ascii="Century Gothic" w:hAnsi="Century Gothic" w:eastAsia="Times New Roman" w:cs="Arial"/>
+          <w:b/>
+          <w:sz w:val="20"/>
+          <w:szCs w:val="20"/>
+        </w:rPr>
+      </w:pPr>
+      <w:r>
+        <w:rPr>
+          <w:rFonts w:eastAsia="Times New Roman" w:cs="Arial" w:ascii="Century Gothic" w:hAnsi="Century Gothic"/>
+          <w:b/>
+          <w:sz w:val="20"/>
+          <w:szCs w:val="20"/>
+        </w:rPr>
+      </w:r>
+    </w:p>
+    <w:p>
+      <w:pPr>
+        <w:pStyle w:val="Normal"/>
+        <w:spacing w:lineRule="auto" w:line="240" w:before="0" w:after="0"/>
+        <w:rPr>
+          <w:rFonts w:ascii="Century Gothic" w:hAnsi="Century Gothic" w:eastAsia="Times New Roman" w:cs="Arial"/>
+          <w:b/>
+          <w:sz w:val="20"/>
+          <w:szCs w:val="20"/>
+        </w:rPr>
+      </w:pPr>
+      <w:r>
+        <w:rPr>
+          <w:rFonts w:eastAsia="Times New Roman" w:cs="Arial" w:ascii="Century Gothic" w:hAnsi="Century Gothic"/>
+          <w:b/>
+          <w:sz w:val="20"/>
+          <w:szCs w:val="20"/>
+        </w:rPr>
+      </w:r>
+    </w:p>
+    <w:p>
+      <w:pPr>
+        <w:pStyle w:val="Normal"/>
+        <w:spacing w:lineRule="auto" w:line="240" w:before="0" w:after="0"/>
+        <w:rPr>
+          <w:rFonts w:ascii="Century Gothic" w:hAnsi="Century Gothic" w:eastAsia="Times New Roman" w:cs="Arial"/>
+          <w:b/>
+          <w:sz w:val="20"/>
+          <w:szCs w:val="20"/>
+        </w:rPr>
+      </w:pPr>
+      <w:r>
+        <w:rPr>
+          <w:rFonts w:eastAsia="Times New Roman" w:cs="Arial" w:ascii="Century Gothic" w:hAnsi="Century Gothic"/>
+          <w:b/>
+          <w:sz w:val="20"/>
+          <w:szCs w:val="20"/>
+        </w:rPr>
+        <w:t xml:space="preserve"> </w:t>
+      </w:r>
+    </w:p>
+    <w:p>
+      <w:pPr>
+        <w:pStyle w:val="Normal"/>
+        <w:spacing w:before="0" w:after="200"/>
+        <w:rPr>
+          <w:rFonts w:ascii="Arial" w:hAnsi="Arial" w:cs="Arial"/>
+        </w:rPr>
+      </w:pPr>
+      <w:r>
+        <w:rPr>
+          <w:rFonts w:cs="Arial" w:ascii="Arial" w:hAnsi="Arial"/>
+        </w:rPr>
+      </w:r>
+    </w:p>
+    <w:sectPr>
+      <w:headerReference w:type="even" r:id="rId3"/>
+      <w:headerReference w:type="default" r:id="rId4"/>
+      <w:headerReference w:type="first" r:id="rId5"/>
+      <w:footerReference w:type="even" r:id="rId6"/>
+      <w:footerReference w:type="default" r:id="rId7"/>
+      <w:footerReference w:type="first" r:id="rId8"/>
+      <w:type w:val="nextPage"/>
+      <w:pgSz w:w="11906" w:h="16838"/>
+      <w:pgMar w:left="1418" w:right="964" w:gutter="0" w:header="709" w:top="1418" w:footer="709" w:bottom="1134"/>
+      <w:pgNumType w:fmt="decimal"/>
+      <w:formProt w:val="false"/>
+      <w:textDirection w:val="lrTb"/>
+      <w:docGrid w:type="default" w:linePitch="360" w:charSpace="0"/>
+    </w:sectPr>
+  </w:body>
+</w:document>
 </file>
 
 <file path=word/footer1.xml><?xml version="1.0" encoding="utf-8"?>

</xml_diff>